<commit_message>
fix: expose actionable Bybit private API diagnostics in preflight
- add BybitAPIError with safe retCode/retMsg/path/http diagnostics
- split private runtime checks into query-api, wallet-balance, positions and trade permissions
- replace opaque RuntimeError reason with concrete Bybit private API reasons
- add safe data.bybit_private_errors for operator troubleshooting
- add operator_private_api_hint with exact remediation steps
- add wallet-balance fallback from UNIFIED to CONTRACT account mode
- update operator reason labels and contextual help for Bybit private failures
- update README, RUNBOOK and operator manual with testnet private API troubleshooting
- add regression test for private API failure diagnostics
- keep fail-closed behavior and avoid leaking API keys or secrets
</commit_message>
<xml_diff>
--- a/docs/OPERATOR_MANUAL.docx
+++ b/docs/OPERATOR_MANUAL.docx
@@ -3,1633 +3,615 @@
 <w:document xmlns:wpc="http://schemas.microsoft.com/office/word/2010/wordprocessingCanvas" xmlns:mo="http://schemas.microsoft.com/office/mac/office/2008/main" xmlns:mc="http://schemas.openxmlformats.org/markup-compatibility/2006" xmlns:mv="urn:schemas-microsoft-com:mac:vml" xmlns:o="urn:schemas-microsoft-com:office:office" xmlns:r="http://schemas.openxmlformats.org/officeDocument/2006/relationships" xmlns:m="http://schemas.openxmlformats.org/officeDocument/2006/math" xmlns:v="urn:schemas-microsoft-com:vml" xmlns:wp14="http://schemas.microsoft.com/office/word/2010/wordprocessingDrawing" xmlns:wp="http://schemas.openxmlformats.org/drawingml/2006/wordprocessingDrawing" xmlns:w10="urn:schemas-microsoft-com:office:word" xmlns:w="http://schemas.openxmlformats.org/wordprocessingml/2006/main" xmlns:w14="http://schemas.microsoft.com/office/word/2010/wordml" xmlns:wpg="http://schemas.microsoft.com/office/word/2010/wordprocessingGroup" xmlns:wpi="http://schemas.microsoft.com/office/word/2010/wordprocessingInk" xmlns:wne="http://schemas.microsoft.com/office/word/2006/wordml" xmlns:wps="http://schemas.microsoft.com/office/word/2010/wordprocessingShape" mc:Ignorable="w14 wp14">
   <w:body>
     <w:p>
-      <w:pPr>
-        <w:jc w:val="center"/>
-      </w:pPr>
       <w:r>
         <w:rPr>
-          <w:rFonts w:ascii="Arial" w:hAnsi="Arial"/>
           <w:b/>
-          <w:sz w:val="40"/>
+          <w:sz w:val="36"/>
         </w:rPr>
         <w:t>Crypto Acceleration System 2026</w:t>
       </w:r>
     </w:p>
     <w:p>
-      <w:pPr>
-        <w:jc w:val="center"/>
-      </w:pPr>
       <w:r>
         <w:rPr>
-          <w:rFonts w:ascii="Arial" w:hAnsi="Arial"/>
-          <w:sz w:val="24"/>
+          <w:b/>
+          <w:sz w:val="28"/>
         </w:rPr>
-        <w:t>Руководство оператора · версия с компактным Операционным центром</w:t>
-      </w:r>
-    </w:p>
-    <w:p>
-      <w:pPr>
-        <w:pStyle w:val="Heading1"/>
-      </w:pPr>
-      <w:r>
-        <w:t>1. Смысл экрана</w:t>
+        <w:t>Руководство оператора</w:t>
       </w:r>
     </w:p>
     <w:p>
       <w:r>
-        <w:t>Операторский модуль не является торговым терминалом для ручного открытия сделок. Он показывает состояние backend, объясняет блокировки и позволяет запускать только безопасные проверки и risk-reducing действия.</w:t>
+        <w:t>Версия: operator UX + Bybit private diagnostics</w:t>
       </w:r>
     </w:p>
     <w:p>
       <w:r>
-        <w:t>Главное правило: если live blocked, это нормальное fail-closed состояние до полного PASS. Не нужно искать обходной путь.</w:t>
-      </w:r>
-    </w:p>
-    <w:tbl>
-      <w:tblPr>
-        <w:tblStyle w:val="TableGrid"/>
-        <w:tblW w:type="auto" w:w="0"/>
-        <w:jc w:val="center"/>
-        <w:tblLook w:firstColumn="1" w:firstRow="1" w:lastColumn="0" w:lastRow="0" w:noHBand="0" w:noVBand="1" w:val="04A0"/>
-      </w:tblPr>
-      <w:tblGrid>
-        <w:gridCol w:w="3456"/>
-        <w:gridCol w:w="3456"/>
-        <w:gridCol w:w="3456"/>
-      </w:tblGrid>
-      <w:tr>
-        <w:tc>
-          <w:tcPr>
-            <w:tcW w:type="dxa" w:w="2232"/>
-            <w:vAlign w:val="center"/>
-            <w:shd w:fill="D9EAF7"/>
-          </w:tcPr>
-          <w:p>
-            <w:r>
-              <w:rPr>
-                <w:rFonts w:ascii="Arial" w:hAnsi="Arial"/>
-                <w:sz w:val="18"/>
-              </w:rPr>
-            </w:r>
-            <w:r>
-              <w:rPr>
-                <w:rFonts w:ascii="Arial" w:hAnsi="Arial"/>
-                <w:b/>
-                <w:sz w:val="18"/>
-              </w:rPr>
-              <w:t>Блок экрана</w:t>
-            </w:r>
-          </w:p>
-        </w:tc>
-        <w:tc>
-          <w:tcPr>
-            <w:tcW w:type="dxa" w:w="4320"/>
-            <w:vAlign w:val="center"/>
-            <w:shd w:fill="D9EAF7"/>
-          </w:tcPr>
-          <w:p>
-            <w:r>
-              <w:rPr>
-                <w:rFonts w:ascii="Arial" w:hAnsi="Arial"/>
-                <w:sz w:val="18"/>
-              </w:rPr>
-            </w:r>
-            <w:r>
-              <w:rPr>
-                <w:rFonts w:ascii="Arial" w:hAnsi="Arial"/>
-                <w:b/>
-                <w:sz w:val="18"/>
-              </w:rPr>
-              <w:t>Что означает</w:t>
-            </w:r>
-          </w:p>
-        </w:tc>
-        <w:tc>
-          <w:tcPr>
-            <w:tcW w:type="dxa" w:w="3168"/>
-            <w:vAlign w:val="center"/>
-            <w:shd w:fill="D9EAF7"/>
-          </w:tcPr>
-          <w:p>
-            <w:r>
-              <w:rPr>
-                <w:rFonts w:ascii="Arial" w:hAnsi="Arial"/>
-                <w:sz w:val="18"/>
-              </w:rPr>
-            </w:r>
-            <w:r>
-              <w:rPr>
-                <w:rFonts w:ascii="Arial" w:hAnsi="Arial"/>
-                <w:b/>
-                <w:sz w:val="18"/>
-              </w:rPr>
-              <w:t>Что делает оператор</w:t>
-            </w:r>
-          </w:p>
-        </w:tc>
-      </w:tr>
-      <w:tr>
-        <w:tc>
-          <w:tcPr>
-            <w:tcW w:type="dxa" w:w="2232"/>
-            <w:vAlign w:val="center"/>
-          </w:tcPr>
-          <w:p>
-            <w:r>
-              <w:rPr>
-                <w:rFonts w:ascii="Arial" w:hAnsi="Arial"/>
-                <w:sz w:val="18"/>
-              </w:rPr>
-            </w:r>
-            <w:r>
-              <w:rPr>
-                <w:rFonts w:ascii="Arial" w:hAnsi="Arial"/>
-                <w:b w:val="0"/>
-                <w:sz w:val="18"/>
-              </w:rPr>
-              <w:t>Главный статус</w:t>
-            </w:r>
-          </w:p>
-        </w:tc>
-        <w:tc>
-          <w:tcPr>
-            <w:tcW w:type="dxa" w:w="4320"/>
-            <w:vAlign w:val="center"/>
-          </w:tcPr>
-          <w:p>
-            <w:r>
-              <w:rPr>
-                <w:rFonts w:ascii="Arial" w:hAnsi="Arial"/>
-                <w:sz w:val="18"/>
-              </w:rPr>
-            </w:r>
-            <w:r>
-              <w:rPr>
-                <w:rFonts w:ascii="Arial" w:hAnsi="Arial"/>
-                <w:b w:val="0"/>
-                <w:sz w:val="18"/>
-              </w:rPr>
-              <w:t>Один главный ответ backend: безопасный режим, blocked или live-ready.</w:t>
-            </w:r>
-          </w:p>
-        </w:tc>
-        <w:tc>
-          <w:tcPr>
-            <w:tcW w:type="dxa" w:w="3168"/>
-            <w:vAlign w:val="center"/>
-          </w:tcPr>
-          <w:p>
-            <w:r>
-              <w:rPr>
-                <w:rFonts w:ascii="Arial" w:hAnsi="Arial"/>
-                <w:sz w:val="18"/>
-              </w:rPr>
-            </w:r>
-            <w:r>
-              <w:rPr>
-                <w:rFonts w:ascii="Arial" w:hAnsi="Arial"/>
-                <w:b w:val="0"/>
-                <w:sz w:val="18"/>
-              </w:rPr>
-              <w:t>Читает “Что делать сейчас”.</w:t>
-            </w:r>
-          </w:p>
-        </w:tc>
-      </w:tr>
-      <w:tr>
-        <w:tc>
-          <w:tcPr>
-            <w:tcW w:type="dxa" w:w="2232"/>
-            <w:vAlign w:val="center"/>
-          </w:tcPr>
-          <w:p>
-            <w:r>
-              <w:rPr>
-                <w:rFonts w:ascii="Arial" w:hAnsi="Arial"/>
-                <w:sz w:val="18"/>
-              </w:rPr>
-            </w:r>
-            <w:r>
-              <w:rPr>
-                <w:rFonts w:ascii="Arial" w:hAnsi="Arial"/>
-                <w:b w:val="0"/>
-                <w:sz w:val="18"/>
-              </w:rPr>
-              <w:t>Панель допуска</w:t>
-            </w:r>
-          </w:p>
-        </w:tc>
-        <w:tc>
-          <w:tcPr>
-            <w:tcW w:type="dxa" w:w="4320"/>
-            <w:vAlign w:val="center"/>
-          </w:tcPr>
-          <w:p>
-            <w:r>
-              <w:rPr>
-                <w:rFonts w:ascii="Arial" w:hAnsi="Arial"/>
-                <w:sz w:val="18"/>
-              </w:rPr>
-            </w:r>
-            <w:r>
-              <w:rPr>
-                <w:rFonts w:ascii="Arial" w:hAnsi="Arial"/>
-                <w:b w:val="0"/>
-                <w:sz w:val="18"/>
-              </w:rPr>
-              <w:t>Компактные индикаторы торговли, БД, risk, live gate, фазы и ML.</w:t>
-            </w:r>
-          </w:p>
-        </w:tc>
-        <w:tc>
-          <w:tcPr>
-            <w:tcW w:type="dxa" w:w="3168"/>
-            <w:vAlign w:val="center"/>
-          </w:tcPr>
-          <w:p>
-            <w:r>
-              <w:rPr>
-                <w:rFonts w:ascii="Arial" w:hAnsi="Arial"/>
-                <w:sz w:val="18"/>
-              </w:rPr>
-            </w:r>
-            <w:r>
-              <w:rPr>
-                <w:rFonts w:ascii="Arial" w:hAnsi="Arial"/>
-                <w:b w:val="0"/>
-                <w:sz w:val="18"/>
-              </w:rPr>
-              <w:t>Смотрит красные/желтые индикаторы.</w:t>
-            </w:r>
-          </w:p>
-        </w:tc>
-      </w:tr>
-      <w:tr>
-        <w:tc>
-          <w:tcPr>
-            <w:tcW w:type="dxa" w:w="2232"/>
-            <w:vAlign w:val="center"/>
-          </w:tcPr>
-          <w:p>
-            <w:r>
-              <w:rPr>
-                <w:rFonts w:ascii="Arial" w:hAnsi="Arial"/>
-                <w:sz w:val="18"/>
-              </w:rPr>
-            </w:r>
-            <w:r>
-              <w:rPr>
-                <w:rFonts w:ascii="Arial" w:hAnsi="Arial"/>
-                <w:b w:val="0"/>
-                <w:sz w:val="18"/>
-              </w:rPr>
-              <w:t>Операционный центр</w:t>
-            </w:r>
-          </w:p>
-        </w:tc>
-        <w:tc>
-          <w:tcPr>
-            <w:tcW w:type="dxa" w:w="4320"/>
-            <w:vAlign w:val="center"/>
-          </w:tcPr>
-          <w:p>
-            <w:r>
-              <w:rPr>
-                <w:rFonts w:ascii="Arial" w:hAnsi="Arial"/>
-                <w:sz w:val="18"/>
-              </w:rPr>
-            </w:r>
-            <w:r>
-              <w:rPr>
-                <w:rFonts w:ascii="Arial" w:hAnsi="Arial"/>
-                <w:b w:val="0"/>
-                <w:sz w:val="18"/>
-              </w:rPr>
-              <w:t>Единый план и кнопки запуска команд.</w:t>
-            </w:r>
-          </w:p>
-        </w:tc>
-        <w:tc>
-          <w:tcPr>
-            <w:tcW w:type="dxa" w:w="3168"/>
-            <w:vAlign w:val="center"/>
-          </w:tcPr>
-          <w:p>
-            <w:r>
-              <w:rPr>
-                <w:rFonts w:ascii="Arial" w:hAnsi="Arial"/>
-                <w:sz w:val="18"/>
-              </w:rPr>
-            </w:r>
-            <w:r>
-              <w:rPr>
-                <w:rFonts w:ascii="Arial" w:hAnsi="Arial"/>
-                <w:b w:val="0"/>
-                <w:sz w:val="18"/>
-              </w:rPr>
-              <w:t>Вводит ключ, причину и запускает нужный шаг.</w:t>
-            </w:r>
-          </w:p>
-        </w:tc>
-      </w:tr>
-      <w:tr>
-        <w:tc>
-          <w:tcPr>
-            <w:tcW w:type="dxa" w:w="2232"/>
-            <w:vAlign w:val="center"/>
-          </w:tcPr>
-          <w:p>
-            <w:r>
-              <w:rPr>
-                <w:rFonts w:ascii="Arial" w:hAnsi="Arial"/>
-                <w:sz w:val="18"/>
-              </w:rPr>
-            </w:r>
-            <w:r>
-              <w:rPr>
-                <w:rFonts w:ascii="Arial" w:hAnsi="Arial"/>
-                <w:b w:val="0"/>
-                <w:sz w:val="18"/>
-              </w:rPr>
-              <w:t>Что мешает запуску</w:t>
-            </w:r>
-          </w:p>
-        </w:tc>
-        <w:tc>
-          <w:tcPr>
-            <w:tcW w:type="dxa" w:w="4320"/>
-            <w:vAlign w:val="center"/>
-          </w:tcPr>
-          <w:p>
-            <w:r>
-              <w:rPr>
-                <w:rFonts w:ascii="Arial" w:hAnsi="Arial"/>
-                <w:sz w:val="18"/>
-              </w:rPr>
-            </w:r>
-            <w:r>
-              <w:rPr>
-                <w:rFonts w:ascii="Arial" w:hAnsi="Arial"/>
-                <w:b w:val="0"/>
-                <w:sz w:val="18"/>
-              </w:rPr>
-              <w:t>Причины блокировки от backend.</w:t>
-            </w:r>
-          </w:p>
-        </w:tc>
-        <w:tc>
-          <w:tcPr>
-            <w:tcW w:type="dxa" w:w="3168"/>
-            <w:vAlign w:val="center"/>
-          </w:tcPr>
-          <w:p>
-            <w:r>
-              <w:rPr>
-                <w:rFonts w:ascii="Arial" w:hAnsi="Arial"/>
-                <w:sz w:val="18"/>
-              </w:rPr>
-            </w:r>
-            <w:r>
-              <w:rPr>
-                <w:rFonts w:ascii="Arial" w:hAnsi="Arial"/>
-                <w:b w:val="0"/>
-                <w:sz w:val="18"/>
-              </w:rPr>
-              <w:t>Исправляет причины и повторяет проверку.</w:t>
-            </w:r>
-          </w:p>
-        </w:tc>
-      </w:tr>
-      <w:tr>
-        <w:tc>
-          <w:tcPr>
-            <w:tcW w:type="dxa" w:w="2232"/>
-            <w:vAlign w:val="center"/>
-          </w:tcPr>
-          <w:p>
-            <w:r>
-              <w:rPr>
-                <w:rFonts w:ascii="Arial" w:hAnsi="Arial"/>
-                <w:sz w:val="18"/>
-              </w:rPr>
-            </w:r>
-            <w:r>
-              <w:rPr>
-                <w:rFonts w:ascii="Arial" w:hAnsi="Arial"/>
-                <w:b w:val="0"/>
-                <w:sz w:val="18"/>
-              </w:rPr>
-              <w:t>Символы</w:t>
-            </w:r>
-          </w:p>
-        </w:tc>
-        <w:tc>
-          <w:tcPr>
-            <w:tcW w:type="dxa" w:w="4320"/>
-            <w:vAlign w:val="center"/>
-          </w:tcPr>
-          <w:p>
-            <w:r>
-              <w:rPr>
-                <w:rFonts w:ascii="Arial" w:hAnsi="Arial"/>
-                <w:sz w:val="18"/>
-              </w:rPr>
-            </w:r>
-            <w:r>
-              <w:rPr>
-                <w:rFonts w:ascii="Arial" w:hAnsi="Arial"/>
-                <w:b w:val="0"/>
-                <w:sz w:val="18"/>
-              </w:rPr>
-              <w:t>Статус BTCUSDT/ETHUSDT/SOLUSDT из backend status_effective.</w:t>
-            </w:r>
-          </w:p>
-        </w:tc>
-        <w:tc>
-          <w:tcPr>
-            <w:tcW w:type="dxa" w:w="3168"/>
-            <w:vAlign w:val="center"/>
-          </w:tcPr>
-          <w:p>
-            <w:r>
-              <w:rPr>
-                <w:rFonts w:ascii="Arial" w:hAnsi="Arial"/>
-                <w:sz w:val="18"/>
-              </w:rPr>
-            </w:r>
-            <w:r>
-              <w:rPr>
-                <w:rFonts w:ascii="Arial" w:hAnsi="Arial"/>
-                <w:b w:val="0"/>
-                <w:sz w:val="18"/>
-              </w:rPr>
-              <w:t>Выбирает символ и читает детали справа.</w:t>
-            </w:r>
-          </w:p>
-        </w:tc>
-      </w:tr>
-    </w:tbl>
-    <w:p>
-      <w:pPr>
-        <w:pStyle w:val="Heading1"/>
-      </w:pPr>
-      <w:r>
-        <w:t>2. Как запускать команды из интерфейса</w:t>
+        <w:t>Назначение: понятная работа с операторским модулем, testnet/preflight, PostgreSQL, evidence и безопасными действиями.</w:t>
       </w:r>
     </w:p>
     <w:p>
       <w:r>
-        <w:t>В новой версии рядом с черным полем команды на карточке плана есть кнопка запуска. Если кнопки нет, шаг требует ручной записи evidence или длительного paper/shadow периода.</w:t>
+        <w:br w:type="page"/>
       </w:r>
     </w:p>
     <w:p>
       <w:pPr>
-        <w:pStyle w:val="ListNumber"/>
+        <w:pStyle w:val="Heading1"/>
       </w:pPr>
       <w:r>
-        <w:t>Введите OPERATOR_API_KEY в блоке “Операционный центр: план и запуск”.</w:t>
+        <w:t>Руководство оператора</w:t>
       </w:r>
     </w:p>
     <w:p>
       <w:pPr>
-        <w:pStyle w:val="ListNumber"/>
+        <w:pStyle w:val="Heading2"/>
       </w:pPr>
       <w:r>
-        <w:t>Введите понятную причину запуска: например, “проверка после исправления тестов” или “миграции PostgreSQL”.</w:t>
+        <w:t>Назначение</w:t>
       </w:r>
     </w:p>
     <w:p>
       <w:pPr>
-        <w:pStyle w:val="ListNumber"/>
+        <w:spacing w:after="60"/>
       </w:pPr>
       <w:r>
-        <w:t>Нажмите “Запустить” или кнопку ▶ рядом с черным полем команды.</w:t>
+        <w:t>Операторский модуль создан для безопасной работы с Crypto Acceleration System 2026. Он не является торговым терминалом для ручного открытия сделок. Его задача - показать, можно ли тестировать систему, почему live сейчас заблокирован, какие проверки еще нужны и какие безопасные действия доступны оператору.</w:t>
       </w:r>
     </w:p>
     <w:p>
       <w:pPr>
-        <w:pStyle w:val="ListNumber"/>
+        <w:pStyle w:val="Heading2"/>
       </w:pPr>
       <w:r>
-        <w:t>Дождитесь результата job. Смотрите не только stdout/stderr, но и статус: ok, blocked, error или timeout.</w:t>
+        <w:t>Главное правило</w:t>
       </w:r>
     </w:p>
     <w:p>
       <w:pPr>
-        <w:pStyle w:val="ListNumber"/>
+        <w:spacing w:after="60"/>
       </w:pPr>
       <w:r>
-        <w:t>После исправления причины нажмите “Обновить” или повторите нужную команду.</w:t>
-      </w:r>
-    </w:p>
-    <w:tbl>
-      <w:tblPr>
-        <w:tblStyle w:val="TableGrid"/>
-        <w:tblW w:type="auto" w:w="0"/>
-        <w:jc w:val="center"/>
-        <w:tblLook w:firstColumn="1" w:firstRow="1" w:lastColumn="0" w:lastRow="0" w:noHBand="0" w:noVBand="1" w:val="04A0"/>
-      </w:tblPr>
-      <w:tblGrid>
-        <w:gridCol w:w="3456"/>
-        <w:gridCol w:w="3456"/>
-        <w:gridCol w:w="3456"/>
-      </w:tblGrid>
-      <w:tr>
-        <w:tc>
-          <w:tcPr>
-            <w:tcW w:type="dxa" w:w="1584"/>
-            <w:vAlign w:val="center"/>
-            <w:shd w:fill="D9EAF7"/>
-          </w:tcPr>
-          <w:p>
-            <w:r>
-              <w:rPr>
-                <w:rFonts w:ascii="Arial" w:hAnsi="Arial"/>
-                <w:sz w:val="18"/>
-              </w:rPr>
-            </w:r>
-            <w:r>
-              <w:rPr>
-                <w:rFonts w:ascii="Arial" w:hAnsi="Arial"/>
-                <w:b/>
-                <w:sz w:val="18"/>
-              </w:rPr>
-              <w:t>Статус job</w:t>
-            </w:r>
-          </w:p>
-        </w:tc>
-        <w:tc>
-          <w:tcPr>
-            <w:tcW w:type="dxa" w:w="3888"/>
-            <w:vAlign w:val="center"/>
-            <w:shd w:fill="D9EAF7"/>
-          </w:tcPr>
-          <w:p>
-            <w:r>
-              <w:rPr>
-                <w:rFonts w:ascii="Arial" w:hAnsi="Arial"/>
-                <w:sz w:val="18"/>
-              </w:rPr>
-            </w:r>
-            <w:r>
-              <w:rPr>
-                <w:rFonts w:ascii="Arial" w:hAnsi="Arial"/>
-                <w:b/>
-                <w:sz w:val="18"/>
-              </w:rPr>
-              <w:t>Что значит</w:t>
-            </w:r>
-          </w:p>
-        </w:tc>
-        <w:tc>
-          <w:tcPr>
-            <w:tcW w:type="dxa" w:w="4320"/>
-            <w:vAlign w:val="center"/>
-            <w:shd w:fill="D9EAF7"/>
-          </w:tcPr>
-          <w:p>
-            <w:r>
-              <w:rPr>
-                <w:rFonts w:ascii="Arial" w:hAnsi="Arial"/>
-                <w:sz w:val="18"/>
-              </w:rPr>
-            </w:r>
-            <w:r>
-              <w:rPr>
-                <w:rFonts w:ascii="Arial" w:hAnsi="Arial"/>
-                <w:b/>
-                <w:sz w:val="18"/>
-              </w:rPr>
-              <w:t>Что делать</w:t>
-            </w:r>
-          </w:p>
-        </w:tc>
-      </w:tr>
-      <w:tr>
-        <w:tc>
-          <w:tcPr>
-            <w:tcW w:type="dxa" w:w="1584"/>
-            <w:vAlign w:val="center"/>
-          </w:tcPr>
-          <w:p>
-            <w:r>
-              <w:rPr>
-                <w:rFonts w:ascii="Arial" w:hAnsi="Arial"/>
-                <w:sz w:val="18"/>
-              </w:rPr>
-            </w:r>
-            <w:r>
-              <w:rPr>
-                <w:rFonts w:ascii="Arial" w:hAnsi="Arial"/>
-                <w:b w:val="0"/>
-                <w:sz w:val="18"/>
-              </w:rPr>
-              <w:t>ok</w:t>
-            </w:r>
-          </w:p>
-        </w:tc>
-        <w:tc>
-          <w:tcPr>
-            <w:tcW w:type="dxa" w:w="3888"/>
-            <w:vAlign w:val="center"/>
-          </w:tcPr>
-          <w:p>
-            <w:r>
-              <w:rPr>
-                <w:rFonts w:ascii="Arial" w:hAnsi="Arial"/>
-                <w:sz w:val="18"/>
-              </w:rPr>
-            </w:r>
-            <w:r>
-              <w:rPr>
-                <w:rFonts w:ascii="Arial" w:hAnsi="Arial"/>
-                <w:b w:val="0"/>
-                <w:sz w:val="18"/>
-              </w:rPr>
-              <w:t>Команда реально прошла.</w:t>
-            </w:r>
-          </w:p>
-        </w:tc>
-        <w:tc>
-          <w:tcPr>
-            <w:tcW w:type="dxa" w:w="4320"/>
-            <w:vAlign w:val="center"/>
-          </w:tcPr>
-          <w:p>
-            <w:r>
-              <w:rPr>
-                <w:rFonts w:ascii="Arial" w:hAnsi="Arial"/>
-                <w:sz w:val="18"/>
-              </w:rPr>
-            </w:r>
-            <w:r>
-              <w:rPr>
-                <w:rFonts w:ascii="Arial" w:hAnsi="Arial"/>
-                <w:b w:val="0"/>
-                <w:sz w:val="18"/>
-              </w:rPr>
-              <w:t>Переходить к следующему шагу.</w:t>
-            </w:r>
-          </w:p>
-        </w:tc>
-      </w:tr>
-      <w:tr>
-        <w:tc>
-          <w:tcPr>
-            <w:tcW w:type="dxa" w:w="1584"/>
-            <w:vAlign w:val="center"/>
-          </w:tcPr>
-          <w:p>
-            <w:r>
-              <w:rPr>
-                <w:rFonts w:ascii="Arial" w:hAnsi="Arial"/>
-                <w:sz w:val="18"/>
-              </w:rPr>
-            </w:r>
-            <w:r>
-              <w:rPr>
-                <w:rFonts w:ascii="Arial" w:hAnsi="Arial"/>
-                <w:b w:val="0"/>
-                <w:sz w:val="18"/>
-              </w:rPr>
-              <w:t>blocked</w:t>
-            </w:r>
-          </w:p>
-        </w:tc>
-        <w:tc>
-          <w:tcPr>
-            <w:tcW w:type="dxa" w:w="3888"/>
-            <w:vAlign w:val="center"/>
-          </w:tcPr>
-          <w:p>
-            <w:r>
-              <w:rPr>
-                <w:rFonts w:ascii="Arial" w:hAnsi="Arial"/>
-                <w:sz w:val="18"/>
-              </w:rPr>
-            </w:r>
-            <w:r>
-              <w:rPr>
-                <w:rFonts w:ascii="Arial" w:hAnsi="Arial"/>
-                <w:b w:val="0"/>
-                <w:sz w:val="18"/>
-              </w:rPr>
-              <w:t>Система безопасно не дала пройти дальше.</w:t>
-            </w:r>
-          </w:p>
-        </w:tc>
-        <w:tc>
-          <w:tcPr>
-            <w:tcW w:type="dxa" w:w="4320"/>
-            <w:vAlign w:val="center"/>
-          </w:tcPr>
-          <w:p>
-            <w:r>
-              <w:rPr>
-                <w:rFonts w:ascii="Arial" w:hAnsi="Arial"/>
-                <w:sz w:val="18"/>
-              </w:rPr>
-            </w:r>
-            <w:r>
-              <w:rPr>
-                <w:rFonts w:ascii="Arial" w:hAnsi="Arial"/>
-                <w:b w:val="0"/>
-                <w:sz w:val="18"/>
-              </w:rPr>
-              <w:t>Читать reasons, исправлять причину, повторить.</w:t>
-            </w:r>
-          </w:p>
-        </w:tc>
-      </w:tr>
-      <w:tr>
-        <w:tc>
-          <w:tcPr>
-            <w:tcW w:type="dxa" w:w="1584"/>
-            <w:vAlign w:val="center"/>
-          </w:tcPr>
-          <w:p>
-            <w:r>
-              <w:rPr>
-                <w:rFonts w:ascii="Arial" w:hAnsi="Arial"/>
-                <w:sz w:val="18"/>
-              </w:rPr>
-            </w:r>
-            <w:r>
-              <w:rPr>
-                <w:rFonts w:ascii="Arial" w:hAnsi="Arial"/>
-                <w:b w:val="0"/>
-                <w:sz w:val="18"/>
-              </w:rPr>
-              <w:t>error</w:t>
-            </w:r>
-          </w:p>
-        </w:tc>
-        <w:tc>
-          <w:tcPr>
-            <w:tcW w:type="dxa" w:w="3888"/>
-            <w:vAlign w:val="center"/>
-          </w:tcPr>
-          <w:p>
-            <w:r>
-              <w:rPr>
-                <w:rFonts w:ascii="Arial" w:hAnsi="Arial"/>
-                <w:sz w:val="18"/>
-              </w:rPr>
-            </w:r>
-            <w:r>
-              <w:rPr>
-                <w:rFonts w:ascii="Arial" w:hAnsi="Arial"/>
-                <w:b w:val="0"/>
-                <w:sz w:val="18"/>
-              </w:rPr>
-              <w:t>Traceback, pytest failure или ошибка исполнения.</w:t>
-            </w:r>
-          </w:p>
-        </w:tc>
-        <w:tc>
-          <w:tcPr>
-            <w:tcW w:type="dxa" w:w="4320"/>
-            <w:vAlign w:val="center"/>
-          </w:tcPr>
-          <w:p>
-            <w:r>
-              <w:rPr>
-                <w:rFonts w:ascii="Arial" w:hAnsi="Arial"/>
-                <w:sz w:val="18"/>
-              </w:rPr>
-            </w:r>
-            <w:r>
-              <w:rPr>
-                <w:rFonts w:ascii="Arial" w:hAnsi="Arial"/>
-                <w:b w:val="0"/>
-                <w:sz w:val="18"/>
-              </w:rPr>
-              <w:t>Остановиться, исправить код/настройки. Live запрещен.</w:t>
-            </w:r>
-          </w:p>
-        </w:tc>
-      </w:tr>
-      <w:tr>
-        <w:tc>
-          <w:tcPr>
-            <w:tcW w:type="dxa" w:w="1584"/>
-            <w:vAlign w:val="center"/>
-          </w:tcPr>
-          <w:p>
-            <w:r>
-              <w:rPr>
-                <w:rFonts w:ascii="Arial" w:hAnsi="Arial"/>
-                <w:sz w:val="18"/>
-              </w:rPr>
-            </w:r>
-            <w:r>
-              <w:rPr>
-                <w:rFonts w:ascii="Arial" w:hAnsi="Arial"/>
-                <w:b w:val="0"/>
-                <w:sz w:val="18"/>
-              </w:rPr>
-              <w:t>timeout</w:t>
-            </w:r>
-          </w:p>
-        </w:tc>
-        <w:tc>
-          <w:tcPr>
-            <w:tcW w:type="dxa" w:w="3888"/>
-            <w:vAlign w:val="center"/>
-          </w:tcPr>
-          <w:p>
-            <w:r>
-              <w:rPr>
-                <w:rFonts w:ascii="Arial" w:hAnsi="Arial"/>
-                <w:sz w:val="18"/>
-              </w:rPr>
-            </w:r>
-            <w:r>
-              <w:rPr>
-                <w:rFonts w:ascii="Arial" w:hAnsi="Arial"/>
-                <w:b w:val="0"/>
-                <w:sz w:val="18"/>
-              </w:rPr>
-              <w:t>Команда не уложилась во время.</w:t>
-            </w:r>
-          </w:p>
-        </w:tc>
-        <w:tc>
-          <w:tcPr>
-            <w:tcW w:type="dxa" w:w="4320"/>
-            <w:vAlign w:val="center"/>
-          </w:tcPr>
-          <w:p>
-            <w:r>
-              <w:rPr>
-                <w:rFonts w:ascii="Arial" w:hAnsi="Arial"/>
-                <w:sz w:val="18"/>
-              </w:rPr>
-            </w:r>
-            <w:r>
-              <w:rPr>
-                <w:rFonts w:ascii="Arial" w:hAnsi="Arial"/>
-                <w:b w:val="0"/>
-                <w:sz w:val="18"/>
-              </w:rPr>
-              <w:t>Проверить БД, сеть, зависимости.</w:t>
-            </w:r>
-          </w:p>
-        </w:tc>
-      </w:tr>
-    </w:tbl>
-    <w:p>
-      <w:pPr>
-        <w:pStyle w:val="Heading1"/>
-      </w:pPr>
-      <w:r>
-        <w:t>3. Команды в плане</w:t>
-      </w:r>
-    </w:p>
-    <w:tbl>
-      <w:tblPr>
-        <w:tblStyle w:val="TableGrid"/>
-        <w:tblW w:type="auto" w:w="0"/>
-        <w:jc w:val="center"/>
-        <w:tblLook w:firstColumn="1" w:firstRow="1" w:lastColumn="0" w:lastRow="0" w:noHBand="0" w:noVBand="1" w:val="04A0"/>
-      </w:tblPr>
-      <w:tblGrid>
-        <w:gridCol w:w="3456"/>
-        <w:gridCol w:w="3456"/>
-        <w:gridCol w:w="3456"/>
-      </w:tblGrid>
-      <w:tr>
-        <w:tc>
-          <w:tcPr>
-            <w:tcW w:type="dxa" w:w="2160"/>
-            <w:vAlign w:val="center"/>
-            <w:shd w:fill="D9EAF7"/>
-          </w:tcPr>
-          <w:p>
-            <w:r>
-              <w:rPr>
-                <w:rFonts w:ascii="Arial" w:hAnsi="Arial"/>
-                <w:sz w:val="18"/>
-              </w:rPr>
-            </w:r>
-            <w:r>
-              <w:rPr>
-                <w:rFonts w:ascii="Arial" w:hAnsi="Arial"/>
-                <w:b/>
-                <w:sz w:val="18"/>
-              </w:rPr>
-              <w:t>Шаг</w:t>
-            </w:r>
-          </w:p>
-        </w:tc>
-        <w:tc>
-          <w:tcPr>
-            <w:tcW w:type="dxa" w:w="3384"/>
-            <w:vAlign w:val="center"/>
-            <w:shd w:fill="D9EAF7"/>
-          </w:tcPr>
-          <w:p>
-            <w:r>
-              <w:rPr>
-                <w:rFonts w:ascii="Arial" w:hAnsi="Arial"/>
-                <w:sz w:val="18"/>
-              </w:rPr>
-            </w:r>
-            <w:r>
-              <w:rPr>
-                <w:rFonts w:ascii="Arial" w:hAnsi="Arial"/>
-                <w:b/>
-                <w:sz w:val="18"/>
-              </w:rPr>
-              <w:t>Команда</w:t>
-            </w:r>
-          </w:p>
-        </w:tc>
-        <w:tc>
-          <w:tcPr>
-            <w:tcW w:type="dxa" w:w="4320"/>
-            <w:vAlign w:val="center"/>
-            <w:shd w:fill="D9EAF7"/>
-          </w:tcPr>
-          <w:p>
-            <w:r>
-              <w:rPr>
-                <w:rFonts w:ascii="Arial" w:hAnsi="Arial"/>
-                <w:sz w:val="18"/>
-              </w:rPr>
-            </w:r>
-            <w:r>
-              <w:rPr>
-                <w:rFonts w:ascii="Arial" w:hAnsi="Arial"/>
-                <w:b/>
-                <w:sz w:val="18"/>
-              </w:rPr>
-              <w:t>Когда PASS</w:t>
-            </w:r>
-          </w:p>
-        </w:tc>
-      </w:tr>
-      <w:tr>
-        <w:tc>
-          <w:tcPr>
-            <w:tcW w:type="dxa" w:w="2160"/>
-            <w:vAlign w:val="center"/>
-          </w:tcPr>
-          <w:p>
-            <w:r>
-              <w:rPr>
-                <w:rFonts w:ascii="Arial" w:hAnsi="Arial"/>
-                <w:sz w:val="18"/>
-              </w:rPr>
-            </w:r>
-            <w:r>
-              <w:rPr>
-                <w:rFonts w:ascii="Arial" w:hAnsi="Arial"/>
-                <w:b w:val="0"/>
-                <w:sz w:val="18"/>
-              </w:rPr>
-              <w:t>1. Локальная проверка кода</w:t>
-            </w:r>
-          </w:p>
-        </w:tc>
-        <w:tc>
-          <w:tcPr>
-            <w:tcW w:type="dxa" w:w="3384"/>
-            <w:vAlign w:val="center"/>
-          </w:tcPr>
-          <w:p>
-            <w:r>
-              <w:rPr>
-                <w:rFonts w:ascii="Arial" w:hAnsi="Arial"/>
-                <w:sz w:val="18"/>
-              </w:rPr>
-            </w:r>
-            <w:r>
-              <w:rPr>
-                <w:rFonts w:ascii="Arial" w:hAnsi="Arial"/>
-                <w:b w:val="0"/>
-                <w:sz w:val="18"/>
-              </w:rPr>
-              <w:t>python main.py validate</w:t>
-            </w:r>
-          </w:p>
-        </w:tc>
-        <w:tc>
-          <w:tcPr>
-            <w:tcW w:type="dxa" w:w="4320"/>
-            <w:vAlign w:val="center"/>
-          </w:tcPr>
-          <w:p>
-            <w:r>
-              <w:rPr>
-                <w:rFonts w:ascii="Arial" w:hAnsi="Arial"/>
-                <w:sz w:val="18"/>
-              </w:rPr>
-            </w:r>
-            <w:r>
-              <w:rPr>
-                <w:rFonts w:ascii="Arial" w:hAnsi="Arial"/>
-                <w:b w:val="0"/>
-                <w:sz w:val="18"/>
-              </w:rPr>
-              <w:t>Все тесты, architecture checks, migration checks и secret scan прошли.</w:t>
-            </w:r>
-          </w:p>
-        </w:tc>
-      </w:tr>
-      <w:tr>
-        <w:tc>
-          <w:tcPr>
-            <w:tcW w:type="dxa" w:w="2160"/>
-            <w:vAlign w:val="center"/>
-          </w:tcPr>
-          <w:p>
-            <w:r>
-              <w:rPr>
-                <w:rFonts w:ascii="Arial" w:hAnsi="Arial"/>
-                <w:sz w:val="18"/>
-              </w:rPr>
-            </w:r>
-            <w:r>
-              <w:rPr>
-                <w:rFonts w:ascii="Arial" w:hAnsi="Arial"/>
-                <w:b w:val="0"/>
-                <w:sz w:val="18"/>
-              </w:rPr>
-              <w:t>2. Testnet preflight</w:t>
-            </w:r>
-          </w:p>
-        </w:tc>
-        <w:tc>
-          <w:tcPr>
-            <w:tcW w:type="dxa" w:w="3384"/>
-            <w:vAlign w:val="center"/>
-          </w:tcPr>
-          <w:p>
-            <w:r>
-              <w:rPr>
-                <w:rFonts w:ascii="Arial" w:hAnsi="Arial"/>
-                <w:sz w:val="18"/>
-              </w:rPr>
-            </w:r>
-            <w:r>
-              <w:rPr>
-                <w:rFonts w:ascii="Arial" w:hAnsi="Arial"/>
-                <w:b w:val="0"/>
-                <w:sz w:val="18"/>
-              </w:rPr>
-              <w:t>python main.py preflight --mode testnet</w:t>
-            </w:r>
-          </w:p>
-        </w:tc>
-        <w:tc>
-          <w:tcPr>
-            <w:tcW w:type="dxa" w:w="4320"/>
-            <w:vAlign w:val="center"/>
-          </w:tcPr>
-          <w:p>
-            <w:r>
-              <w:rPr>
-                <w:rFonts w:ascii="Arial" w:hAnsi="Arial"/>
-                <w:sz w:val="18"/>
-              </w:rPr>
-            </w:r>
-            <w:r>
-              <w:rPr>
-                <w:rFonts w:ascii="Arial" w:hAnsi="Arial"/>
-                <w:b w:val="0"/>
-                <w:sz w:val="18"/>
-              </w:rPr>
-              <w:t>status=ok. Testnet не требует live-submit и Go/No-Go.</w:t>
-            </w:r>
-          </w:p>
-        </w:tc>
-      </w:tr>
-      <w:tr>
-        <w:tc>
-          <w:tcPr>
-            <w:tcW w:type="dxa" w:w="2160"/>
-            <w:vAlign w:val="center"/>
-          </w:tcPr>
-          <w:p>
-            <w:r>
-              <w:rPr>
-                <w:rFonts w:ascii="Arial" w:hAnsi="Arial"/>
-                <w:sz w:val="18"/>
-              </w:rPr>
-            </w:r>
-            <w:r>
-              <w:rPr>
-                <w:rFonts w:ascii="Arial" w:hAnsi="Arial"/>
-                <w:b w:val="0"/>
-                <w:sz w:val="18"/>
-              </w:rPr>
-              <w:t>3. PostgreSQL и миграции</w:t>
-            </w:r>
-          </w:p>
-        </w:tc>
-        <w:tc>
-          <w:tcPr>
-            <w:tcW w:type="dxa" w:w="3384"/>
-            <w:vAlign w:val="center"/>
-          </w:tcPr>
-          <w:p>
-            <w:r>
-              <w:rPr>
-                <w:rFonts w:ascii="Arial" w:hAnsi="Arial"/>
-                <w:sz w:val="18"/>
-              </w:rPr>
-            </w:r>
-            <w:r>
-              <w:rPr>
-                <w:rFonts w:ascii="Arial" w:hAnsi="Arial"/>
-                <w:b w:val="0"/>
-                <w:sz w:val="18"/>
-              </w:rPr>
-              <w:t>python scripts/bootstrap_db.py</w:t>
-            </w:r>
-          </w:p>
-        </w:tc>
-        <w:tc>
-          <w:tcPr>
-            <w:tcW w:type="dxa" w:w="4320"/>
-            <w:vAlign w:val="center"/>
-          </w:tcPr>
-          <w:p>
-            <w:r>
-              <w:rPr>
-                <w:rFonts w:ascii="Arial" w:hAnsi="Arial"/>
-                <w:sz w:val="18"/>
-              </w:rPr>
-            </w:r>
-            <w:r>
-              <w:rPr>
-                <w:rFonts w:ascii="Arial" w:hAnsi="Arial"/>
-                <w:b w:val="0"/>
-                <w:sz w:val="18"/>
-              </w:rPr>
-              <w:t>database_available=true, таблицы incidents/go_no_go_evidence существуют.</w:t>
-            </w:r>
-          </w:p>
-        </w:tc>
-      </w:tr>
-      <w:tr>
-        <w:tc>
-          <w:tcPr>
-            <w:tcW w:type="dxa" w:w="2160"/>
-            <w:vAlign w:val="center"/>
-          </w:tcPr>
-          <w:p>
-            <w:r>
-              <w:rPr>
-                <w:rFonts w:ascii="Arial" w:hAnsi="Arial"/>
-                <w:sz w:val="18"/>
-              </w:rPr>
-            </w:r>
-            <w:r>
-              <w:rPr>
-                <w:rFonts w:ascii="Arial" w:hAnsi="Arial"/>
-                <w:b w:val="0"/>
-                <w:sz w:val="18"/>
-              </w:rPr>
-              <w:t>4. Paper/shadow 14+ дней</w:t>
-            </w:r>
-          </w:p>
-        </w:tc>
-        <w:tc>
-          <w:tcPr>
-            <w:tcW w:type="dxa" w:w="3384"/>
-            <w:vAlign w:val="center"/>
-          </w:tcPr>
-          <w:p>
-            <w:r>
-              <w:rPr>
-                <w:rFonts w:ascii="Arial" w:hAnsi="Arial"/>
-                <w:sz w:val="18"/>
-              </w:rPr>
-            </w:r>
-            <w:r>
-              <w:rPr>
-                <w:rFonts w:ascii="Arial" w:hAnsi="Arial"/>
-                <w:b w:val="0"/>
-                <w:sz w:val="18"/>
-              </w:rPr>
-              <w:t>запись PHASE0_PAPER evidence</w:t>
-            </w:r>
-          </w:p>
-        </w:tc>
-        <w:tc>
-          <w:tcPr>
-            <w:tcW w:type="dxa" w:w="4320"/>
-            <w:vAlign w:val="center"/>
-          </w:tcPr>
-          <w:p>
-            <w:r>
-              <w:rPr>
-                <w:rFonts w:ascii="Arial" w:hAnsi="Arial"/>
-                <w:sz w:val="18"/>
-              </w:rPr>
-            </w:r>
-            <w:r>
-              <w:rPr>
-                <w:rFonts w:ascii="Arial" w:hAnsi="Arial"/>
-                <w:b w:val="0"/>
-                <w:sz w:val="18"/>
-              </w:rPr>
-              <w:t>Накоплены 14+ дней, нет unresolved incidents, reconciliation PASS.</w:t>
-            </w:r>
-          </w:p>
-        </w:tc>
-      </w:tr>
-      <w:tr>
-        <w:tc>
-          <w:tcPr>
-            <w:tcW w:type="dxa" w:w="2160"/>
-            <w:vAlign w:val="center"/>
-          </w:tcPr>
-          <w:p>
-            <w:r>
-              <w:rPr>
-                <w:rFonts w:ascii="Arial" w:hAnsi="Arial"/>
-                <w:sz w:val="18"/>
-              </w:rPr>
-            </w:r>
-            <w:r>
-              <w:rPr>
-                <w:rFonts w:ascii="Arial" w:hAnsi="Arial"/>
-                <w:b w:val="0"/>
-                <w:sz w:val="18"/>
-              </w:rPr>
-              <w:t>5. Go/No-Go PASS</w:t>
-            </w:r>
-          </w:p>
-        </w:tc>
-        <w:tc>
-          <w:tcPr>
-            <w:tcW w:type="dxa" w:w="3384"/>
-            <w:vAlign w:val="center"/>
-          </w:tcPr>
-          <w:p>
-            <w:r>
-              <w:rPr>
-                <w:rFonts w:ascii="Arial" w:hAnsi="Arial"/>
-                <w:sz w:val="18"/>
-              </w:rPr>
-            </w:r>
-            <w:r>
-              <w:rPr>
-                <w:rFonts w:ascii="Arial" w:hAnsi="Arial"/>
-                <w:b w:val="0"/>
-                <w:sz w:val="18"/>
-              </w:rPr>
-              <w:t>запись GO_NO_GO evidence</w:t>
-            </w:r>
-          </w:p>
-        </w:tc>
-        <w:tc>
-          <w:tcPr>
-            <w:tcW w:type="dxa" w:w="4320"/>
-            <w:vAlign w:val="center"/>
-          </w:tcPr>
-          <w:p>
-            <w:r>
-              <w:rPr>
-                <w:rFonts w:ascii="Arial" w:hAnsi="Arial"/>
-                <w:sz w:val="18"/>
-              </w:rPr>
-            </w:r>
-            <w:r>
-              <w:rPr>
-                <w:rFonts w:ascii="Arial" w:hAnsi="Arial"/>
-                <w:b w:val="0"/>
-                <w:sz w:val="18"/>
-              </w:rPr>
-              <w:t>Есть approved-by и signed Go/No-Go PASS.</w:t>
-            </w:r>
-          </w:p>
-        </w:tc>
-      </w:tr>
-      <w:tr>
-        <w:tc>
-          <w:tcPr>
-            <w:tcW w:type="dxa" w:w="2160"/>
-            <w:vAlign w:val="center"/>
-          </w:tcPr>
-          <w:p>
-            <w:r>
-              <w:rPr>
-                <w:rFonts w:ascii="Arial" w:hAnsi="Arial"/>
-                <w:sz w:val="18"/>
-              </w:rPr>
-            </w:r>
-            <w:r>
-              <w:rPr>
-                <w:rFonts w:ascii="Arial" w:hAnsi="Arial"/>
-                <w:b w:val="0"/>
-                <w:sz w:val="18"/>
-              </w:rPr>
-              <w:t>6. Live preflight</w:t>
-            </w:r>
-          </w:p>
-        </w:tc>
-        <w:tc>
-          <w:tcPr>
-            <w:tcW w:type="dxa" w:w="3384"/>
-            <w:vAlign w:val="center"/>
-          </w:tcPr>
-          <w:p>
-            <w:r>
-              <w:rPr>
-                <w:rFonts w:ascii="Arial" w:hAnsi="Arial"/>
-                <w:sz w:val="18"/>
-              </w:rPr>
-            </w:r>
-            <w:r>
-              <w:rPr>
-                <w:rFonts w:ascii="Arial" w:hAnsi="Arial"/>
-                <w:b w:val="0"/>
-                <w:sz w:val="18"/>
-              </w:rPr>
-              <w:t>python main.py preflight --mode live</w:t>
-            </w:r>
-          </w:p>
-        </w:tc>
-        <w:tc>
-          <w:tcPr>
-            <w:tcW w:type="dxa" w:w="4320"/>
-            <w:vAlign w:val="center"/>
-          </w:tcPr>
-          <w:p>
-            <w:r>
-              <w:rPr>
-                <w:rFonts w:ascii="Arial" w:hAnsi="Arial"/>
-                <w:sz w:val="18"/>
-              </w:rPr>
-            </w:r>
-            <w:r>
-              <w:rPr>
-                <w:rFonts w:ascii="Arial" w:hAnsi="Arial"/>
-                <w:b w:val="0"/>
-                <w:sz w:val="18"/>
-              </w:rPr>
-              <w:t>status=ok, все checks=true, unresolved CRITICAL/HIGH=0.</w:t>
-            </w:r>
-          </w:p>
-        </w:tc>
-      </w:tr>
-    </w:tbl>
-    <w:p>
-      <w:pPr>
-        <w:pStyle w:val="Heading1"/>
-      </w:pPr>
-      <w:r>
-        <w:t>4. Testnet и live: не путать</w:t>
-      </w:r>
-    </w:p>
-    <w:tbl>
-      <w:tblPr>
-        <w:tblStyle w:val="TableGrid"/>
-        <w:tblW w:type="auto" w:w="0"/>
-        <w:jc w:val="center"/>
-        <w:tblLook w:firstColumn="1" w:firstRow="1" w:lastColumn="0" w:lastRow="0" w:noHBand="0" w:noVBand="1" w:val="04A0"/>
-      </w:tblPr>
-      <w:tblGrid>
-        <w:gridCol w:w="3456"/>
-        <w:gridCol w:w="3456"/>
-        <w:gridCol w:w="3456"/>
-      </w:tblGrid>
-      <w:tr>
-        <w:tc>
-          <w:tcPr>
-            <w:tcW w:type="dxa" w:w="1656"/>
-            <w:vAlign w:val="center"/>
-            <w:shd w:fill="D9EAF7"/>
-          </w:tcPr>
-          <w:p>
-            <w:r>
-              <w:rPr>
-                <w:rFonts w:ascii="Arial" w:hAnsi="Arial"/>
-                <w:sz w:val="18"/>
-              </w:rPr>
-            </w:r>
-            <w:r>
-              <w:rPr>
-                <w:rFonts w:ascii="Arial" w:hAnsi="Arial"/>
-                <w:b/>
-                <w:sz w:val="18"/>
-              </w:rPr>
-              <w:t>Режим</w:t>
-            </w:r>
-          </w:p>
-        </w:tc>
-        <w:tc>
-          <w:tcPr>
-            <w:tcW w:type="dxa" w:w="4608"/>
-            <w:vAlign w:val="center"/>
-            <w:shd w:fill="D9EAF7"/>
-          </w:tcPr>
-          <w:p>
-            <w:r>
-              <w:rPr>
-                <w:rFonts w:ascii="Arial" w:hAnsi="Arial"/>
-                <w:sz w:val="18"/>
-              </w:rPr>
-            </w:r>
-            <w:r>
-              <w:rPr>
-                <w:rFonts w:ascii="Arial" w:hAnsi="Arial"/>
-                <w:b/>
-                <w:sz w:val="18"/>
-              </w:rPr>
-              <w:t>Что проверяет</w:t>
-            </w:r>
-          </w:p>
-        </w:tc>
-        <w:tc>
-          <w:tcPr>
-            <w:tcW w:type="dxa" w:w="3600"/>
-            <w:vAlign w:val="center"/>
-            <w:shd w:fill="D9EAF7"/>
-          </w:tcPr>
-          <w:p>
-            <w:r>
-              <w:rPr>
-                <w:rFonts w:ascii="Arial" w:hAnsi="Arial"/>
-                <w:sz w:val="18"/>
-              </w:rPr>
-            </w:r>
-            <w:r>
-              <w:rPr>
-                <w:rFonts w:ascii="Arial" w:hAnsi="Arial"/>
-                <w:b/>
-                <w:sz w:val="18"/>
-              </w:rPr>
-              <w:t>Чего НЕ требует</w:t>
-            </w:r>
-          </w:p>
-        </w:tc>
-      </w:tr>
-      <w:tr>
-        <w:tc>
-          <w:tcPr>
-            <w:tcW w:type="dxa" w:w="1656"/>
-            <w:vAlign w:val="center"/>
-          </w:tcPr>
-          <w:p>
-            <w:r>
-              <w:rPr>
-                <w:rFonts w:ascii="Arial" w:hAnsi="Arial"/>
-                <w:sz w:val="18"/>
-              </w:rPr>
-            </w:r>
-            <w:r>
-              <w:rPr>
-                <w:rFonts w:ascii="Arial" w:hAnsi="Arial"/>
-                <w:b w:val="0"/>
-                <w:sz w:val="18"/>
-              </w:rPr>
-              <w:t>testnet</w:t>
-            </w:r>
-          </w:p>
-        </w:tc>
-        <w:tc>
-          <w:tcPr>
-            <w:tcW w:type="dxa" w:w="4608"/>
-            <w:vAlign w:val="center"/>
-          </w:tcPr>
-          <w:p>
-            <w:r>
-              <w:rPr>
-                <w:rFonts w:ascii="Arial" w:hAnsi="Arial"/>
-                <w:sz w:val="18"/>
-              </w:rPr>
-            </w:r>
-            <w:r>
-              <w:rPr>
-                <w:rFonts w:ascii="Arial" w:hAnsi="Arial"/>
-                <w:b w:val="0"/>
-                <w:sz w:val="18"/>
-              </w:rPr>
-              <w:t>PostgreSQL, migrations, testnet endpoint, testnet Bybit credentials, runtime checks, unresolved incidents.</w:t>
-            </w:r>
-          </w:p>
-        </w:tc>
-        <w:tc>
-          <w:tcPr>
-            <w:tcW w:type="dxa" w:w="3600"/>
-            <w:vAlign w:val="center"/>
-          </w:tcPr>
-          <w:p>
-            <w:r>
-              <w:rPr>
-                <w:rFonts w:ascii="Arial" w:hAnsi="Arial"/>
-                <w:sz w:val="18"/>
-              </w:rPr>
-            </w:r>
-            <w:r>
-              <w:rPr>
-                <w:rFonts w:ascii="Arial" w:hAnsi="Arial"/>
-                <w:b w:val="0"/>
-                <w:sz w:val="18"/>
-              </w:rPr>
-              <w:t>Не требует CAS_ENABLE_LIVE_SUBMIT, live Go/No-Go и 14 дней paper evidence.</w:t>
-            </w:r>
-          </w:p>
-        </w:tc>
-      </w:tr>
-      <w:tr>
-        <w:tc>
-          <w:tcPr>
-            <w:tcW w:type="dxa" w:w="1656"/>
-            <w:vAlign w:val="center"/>
-          </w:tcPr>
-          <w:p>
-            <w:r>
-              <w:rPr>
-                <w:rFonts w:ascii="Arial" w:hAnsi="Arial"/>
-                <w:sz w:val="18"/>
-              </w:rPr>
-            </w:r>
-            <w:r>
-              <w:rPr>
-                <w:rFonts w:ascii="Arial" w:hAnsi="Arial"/>
-                <w:b w:val="0"/>
-                <w:sz w:val="18"/>
-              </w:rPr>
-              <w:t>live</w:t>
-            </w:r>
-          </w:p>
-        </w:tc>
-        <w:tc>
-          <w:tcPr>
-            <w:tcW w:type="dxa" w:w="4608"/>
-            <w:vAlign w:val="center"/>
-          </w:tcPr>
-          <w:p>
-            <w:r>
-              <w:rPr>
-                <w:rFonts w:ascii="Arial" w:hAnsi="Arial"/>
-                <w:sz w:val="18"/>
-              </w:rPr>
-            </w:r>
-            <w:r>
-              <w:rPr>
-                <w:rFonts w:ascii="Arial" w:hAnsi="Arial"/>
-                <w:b w:val="0"/>
-                <w:sz w:val="18"/>
-              </w:rPr>
-              <w:t>Все live gates: DB, Bybit runtime, paper/shadow evidence, security/CI/reconciliation evidence, Go/No-Go, отсутствие CRITICAL/HIGH.</w:t>
-            </w:r>
-          </w:p>
-        </w:tc>
-        <w:tc>
-          <w:tcPr>
-            <w:tcW w:type="dxa" w:w="3600"/>
-            <w:vAlign w:val="center"/>
-          </w:tcPr>
-          <w:p>
-            <w:r>
-              <w:rPr>
-                <w:rFonts w:ascii="Arial" w:hAnsi="Arial"/>
-                <w:sz w:val="18"/>
-              </w:rPr>
-            </w:r>
-            <w:r>
-              <w:rPr>
-                <w:rFonts w:ascii="Arial" w:hAnsi="Arial"/>
-                <w:b w:val="0"/>
-                <w:sz w:val="18"/>
-              </w:rPr>
-              <w:t>Не имеет послаблений. До PASS обязан быть blocked.</w:t>
-            </w:r>
-          </w:p>
-        </w:tc>
-      </w:tr>
-    </w:tbl>
-    <w:p>
-      <w:r>
-        <w:t>Если testnet preflight blocked, причины должны быть уровня “нет PostgreSQL”, “нет testnet credentials”, “migrations not applied”, “unresolved incidents” или “Bybit runtime check failed”. Если видите live-submit/Go-No-Go причины в testnet — это ошибка старой версии.</w:t>
+        <w:t>Если интерфейс показывает `Live заблокирован`, это не ошибка. До полного Go/No-Go PASS система обязана блокировать live. Оператор не должен искать обходной путь.</w:t>
       </w:r>
     </w:p>
     <w:p>
       <w:pPr>
-        <w:pStyle w:val="Heading1"/>
+        <w:pStyle w:val="Heading2"/>
       </w:pPr>
       <w:r>
-        <w:t>5. Что запрещено оператору</w:t>
+        <w:t>Как открыть модуль</w:t>
       </w:r>
     </w:p>
     <w:p>
       <w:pPr>
-        <w:pStyle w:val="ListBullet"/>
+        <w:shd w:fill="F1F5F9"/>
       </w:pPr>
       <w:r>
-        <w:t>Открывать сделки вручную в обход risk engine.</w:t>
+        <w:rPr>
+          <w:rFonts w:ascii="Consolas" w:hAnsi="Consolas" w:eastAsia="Consolas"/>
+          <w:sz w:val="16"/>
+        </w:rPr>
+        <w:t>python main.py</w:t>
       </w:r>
     </w:p>
     <w:p>
       <w:pPr>
+        <w:spacing w:after="60"/>
+      </w:pPr>
+      <w:r>
+        <w:t>Затем открыть в браузере:</w:t>
+      </w:r>
+    </w:p>
+    <w:p>
+      <w:pPr>
+        <w:shd w:fill="F1F5F9"/>
+      </w:pPr>
+      <w:r>
+        <w:rPr>
+          <w:rFonts w:ascii="Consolas" w:hAnsi="Consolas" w:eastAsia="Consolas"/>
+          <w:sz w:val="16"/>
+        </w:rPr>
+        <w:t>http://127.0.0.1:8000/</w:t>
+      </w:r>
+    </w:p>
+    <w:p>
+      <w:pPr>
+        <w:pStyle w:val="Heading2"/>
+      </w:pPr>
+      <w:r>
+        <w:t>Что смотреть первым</w:t>
+      </w:r>
+    </w:p>
+    <w:p>
+      <w:pPr>
+        <w:pStyle w:val="ListNumber"/>
+        <w:spacing w:after="40"/>
+      </w:pPr>
+      <w:r>
+        <w:t>**Текущее состояние** - крупный верхний блок. Он отвечает на вопрос: можно ли продолжать и что делать следующим шагом.</w:t>
+      </w:r>
+    </w:p>
+    <w:p>
+      <w:pPr>
+        <w:pStyle w:val="ListNumber"/>
+        <w:spacing w:after="40"/>
+      </w:pPr>
+      <w:r>
+        <w:t>**Панель допуска** - короткие карточки по торговле, БД, risk engine, live gate, фазе и ML.</w:t>
+      </w:r>
+    </w:p>
+    <w:p>
+      <w:pPr>
+        <w:pStyle w:val="ListNumber"/>
+        <w:spacing w:after="40"/>
+      </w:pPr>
+      <w:r>
+        <w:t>**Что мешает запуску** - список причин блокировки. Исправлять сверху вниз.</w:t>
+      </w:r>
+    </w:p>
+    <w:p>
+      <w:pPr>
+        <w:pStyle w:val="ListNumber"/>
+        <w:spacing w:after="40"/>
+      </w:pPr>
+      <w:r>
+        <w:t>**Операционный центр** - запуск разрешенных backend-команд без терминала: validate, preflight и PostgreSQL migrations.</w:t>
+      </w:r>
+    </w:p>
+    <w:p>
+      <w:pPr>
+        <w:pStyle w:val="ListNumber"/>
+        <w:spacing w:after="40"/>
+      </w:pPr>
+      <w:r>
+        <w:t>**План перехода от теста к live** - последовательность проверок.</w:t>
+      </w:r>
+    </w:p>
+    <w:p>
+      <w:pPr>
+        <w:pStyle w:val="ListNumber"/>
+        <w:spacing w:after="40"/>
+      </w:pPr>
+      <w:r>
+        <w:t>**Символы** - понятный статус BTCUSDT, ETHUSDT, SOLUSDT.</w:t>
+      </w:r>
+    </w:p>
+    <w:p>
+      <w:pPr>
+        <w:pStyle w:val="ListNumber"/>
+        <w:spacing w:after="40"/>
+      </w:pPr>
+      <w:r>
+        <w:t>**Безопасные действия оператора** - только disable/cancel/flatten/resolve. Открытия сделки из интерфейса нет.</w:t>
+      </w:r>
+    </w:p>
+    <w:p>
+      <w:pPr>
+        <w:pStyle w:val="Heading2"/>
+      </w:pPr>
+      <w:r>
+        <w:t>Безопасные стартовые настройки Phase 0</w:t>
+      </w:r>
+    </w:p>
+    <w:p>
+      <w:pPr>
         <w:pStyle w:val="ListBullet"/>
+        <w:spacing w:after="40"/>
+      </w:pPr>
+      <w:r>
+        <w:t>`TRADING_ENABLED=false`</w:t>
+      </w:r>
+    </w:p>
+    <w:p>
+      <w:pPr>
+        <w:pStyle w:val="ListBullet"/>
+        <w:spacing w:after="40"/>
+      </w:pPr>
+      <w:r>
+        <w:t>`CAS_ENABLE_LIVE_SUBMIT=false`</w:t>
+      </w:r>
+    </w:p>
+    <w:p>
+      <w:pPr>
+        <w:pStyle w:val="ListBullet"/>
+        <w:spacing w:after="40"/>
+      </w:pPr>
+      <w:r>
+        <w:t>`BYBIT_LIVE_CONFIRM=false`</w:t>
+      </w:r>
+    </w:p>
+    <w:p>
+      <w:pPr>
+        <w:pStyle w:val="ListBullet"/>
+        <w:spacing w:after="40"/>
+      </w:pPr>
+      <w:r>
+        <w:t>`BYBIT_TESTNET=true`</w:t>
+      </w:r>
+    </w:p>
+    <w:p>
+      <w:pPr>
+        <w:pStyle w:val="ListBullet"/>
+        <w:spacing w:after="40"/>
+      </w:pPr>
+      <w:r>
+        <w:t>`CAS_REQUIRE_DB_FOR_LIVE=true`</w:t>
+      </w:r>
+    </w:p>
+    <w:p>
+      <w:pPr>
+        <w:pStyle w:val="ListBullet"/>
+        <w:spacing w:after="40"/>
+      </w:pPr>
+      <w:r>
+        <w:t>`CAS_REQUIRE_LIVE_PREFLIGHT=true`</w:t>
+      </w:r>
+    </w:p>
+    <w:p>
+      <w:pPr>
+        <w:pStyle w:val="ListBullet"/>
+        <w:spacing w:after="40"/>
+      </w:pPr>
+      <w:r>
+        <w:t>`CAS_REQUIRE_GO_NOGO_FOR_LIVE=true`</w:t>
+      </w:r>
+    </w:p>
+    <w:p>
+      <w:pPr>
+        <w:pStyle w:val="ListBullet"/>
+        <w:spacing w:after="40"/>
+      </w:pPr>
+      <w:r>
+        <w:t>`CAS_GO_NOGO_PASS=false`</w:t>
+      </w:r>
+    </w:p>
+    <w:p>
+      <w:pPr>
+        <w:pStyle w:val="ListBullet"/>
+        <w:spacing w:after="40"/>
+      </w:pPr>
+      <w:r>
+        <w:t>`CAS_DEMO_MODE=false`</w:t>
+      </w:r>
+    </w:p>
+    <w:p>
+      <w:pPr>
+        <w:pStyle w:val="ListBullet"/>
+        <w:spacing w:after="40"/>
+      </w:pPr>
+      <w:r>
+        <w:t>`CAS_ALLOW_DEMO_ML=false`</w:t>
+      </w:r>
+    </w:p>
+    <w:p>
+      <w:pPr>
+        <w:spacing w:after="60"/>
+      </w:pPr>
+      <w:r>
+        <w:t>Phase 0: только BTCUSDT, ETHUSDT, SOLUSDT. Риск по умолчанию 1%, абсолютный максимум 1.5%, эффективное плечо по умолчанию не выше 3x.</w:t>
+      </w:r>
+    </w:p>
+    <w:p>
+      <w:pPr>
+        <w:pStyle w:val="Heading2"/>
+      </w:pPr>
+      <w:r>
+        <w:t>Проверки перед testnet</w:t>
+      </w:r>
+    </w:p>
+    <w:p>
+      <w:pPr>
+        <w:spacing w:after="60"/>
+      </w:pPr>
+      <w:r>
+        <w:t>Рекомендуемый путь для оператора — запускать проверки из блока **Операционный центр**. Терминальные команды остаются резервным вариантом:</w:t>
+      </w:r>
+    </w:p>
+    <w:p>
+      <w:pPr>
+        <w:shd w:fill="F1F5F9"/>
+      </w:pPr>
+      <w:r>
+        <w:rPr>
+          <w:rFonts w:ascii="Consolas" w:hAnsi="Consolas" w:eastAsia="Consolas"/>
+          <w:sz w:val="16"/>
+        </w:rPr>
+        <w:t>python main.py validate</w:t>
+        <w:br/>
+        <w:t>python main.py preflight --mode testnet</w:t>
+      </w:r>
+    </w:p>
+    <w:p>
+      <w:pPr>
+        <w:spacing w:after="60"/>
+      </w:pPr>
+      <w:r>
+        <w:t>`validate` должен пройти без ошибок. `preflight --mode testnet` может вернуть `blocked`, если нет ключей, БД или runtime-доступа. Это нормально: исправьте причины из интерфейса и повторите.</w:t>
+      </w:r>
+    </w:p>
+    <w:p>
+      <w:pPr>
+        <w:pStyle w:val="Heading2"/>
+      </w:pPr>
+      <w:r>
+        <w:t>Операционный центр: команды прямо из интерфейса</w:t>
+      </w:r>
+    </w:p>
+    <w:p>
+      <w:pPr>
+        <w:spacing w:after="60"/>
+      </w:pPr>
+      <w:r>
+        <w:t>Теперь основные команды можно запускать из браузера без ручного терминала. Это сделано безопасно: браузер не получает shell-доступ и не может отправить произвольную команду. Он вызывает backend endpoint, а backend запускает только allowlist-команды Python.</w:t>
+      </w:r>
+    </w:p>
+    <w:p>
+      <w:pPr>
+        <w:spacing w:after="60"/>
+      </w:pPr>
+      <w:r>
+        <w:t>Доступные команды:</w:t>
+      </w:r>
+    </w:p>
+    <w:p>
+      <w:r>
+        <w:rPr>
+          <w:rFonts w:ascii="Consolas" w:hAnsi="Consolas" w:eastAsia="Consolas"/>
+          <w:sz w:val="14"/>
+        </w:rPr>
+        <w:t>| Команда в интерфейсе | Что делает | Безопасность |</w:t>
+      </w:r>
+    </w:p>
+    <w:p>
+      <w:r>
+        <w:rPr>
+          <w:rFonts w:ascii="Consolas" w:hAnsi="Consolas" w:eastAsia="Consolas"/>
+          <w:sz w:val="14"/>
+        </w:rPr>
+        <w:t>|---|---|---|</w:t>
+      </w:r>
+    </w:p>
+    <w:p>
+      <w:r>
+        <w:rPr>
+          <w:rFonts w:ascii="Consolas" w:hAnsi="Consolas" w:eastAsia="Consolas"/>
+          <w:sz w:val="14"/>
+        </w:rPr>
+        <w:t>| Локальная проверка проекта | Запускает `python main.py validate` | Не отправляет ордера |</w:t>
+      </w:r>
+    </w:p>
+    <w:p>
+      <w:r>
+        <w:rPr>
+          <w:rFonts w:ascii="Consolas" w:hAnsi="Consolas" w:eastAsia="Consolas"/>
+          <w:sz w:val="14"/>
+        </w:rPr>
+        <w:t>| Testnet preflight | Запускает `python main.py preflight --mode testnet` | Проверка без реальных денег |</w:t>
+      </w:r>
+    </w:p>
+    <w:p>
+      <w:r>
+        <w:rPr>
+          <w:rFonts w:ascii="Consolas" w:hAnsi="Consolas" w:eastAsia="Consolas"/>
+          <w:sz w:val="14"/>
+        </w:rPr>
+        <w:t>| PostgreSQL: применить migrations | Запускает `python scripts/bootstrap_db.py` | Python-замена `./scripts/bootstrap_db.sh`, без shell/psql |</w:t>
+      </w:r>
+    </w:p>
+    <w:p>
+      <w:r>
+        <w:rPr>
+          <w:rFonts w:ascii="Consolas" w:hAnsi="Consolas" w:eastAsia="Consolas"/>
+          <w:sz w:val="14"/>
+        </w:rPr>
+        <w:t>| Live preflight | Запускает `python main.py preflight --mode live` | Только проверяет gates; live-submit не включает |</w:t>
+      </w:r>
+    </w:p>
+    <w:p>
+      <w:pPr>
+        <w:spacing w:after="60"/>
+      </w:pPr>
+      <w:r>
+        <w:t>Как запускать:</w:t>
+      </w:r>
+    </w:p>
+    <w:p>
+      <w:pPr>
+        <w:pStyle w:val="ListNumber"/>
+        <w:spacing w:after="40"/>
+      </w:pPr>
+      <w:r>
+        <w:t>Откройте блок **Операционный центр**.</w:t>
+      </w:r>
+    </w:p>
+    <w:p>
+      <w:pPr>
+        <w:pStyle w:val="ListNumber"/>
+        <w:spacing w:after="40"/>
+      </w:pPr>
+      <w:r>
+        <w:t>Введите `OPERATOR_API_KEY`.</w:t>
+      </w:r>
+    </w:p>
+    <w:p>
+      <w:pPr>
+        <w:pStyle w:val="ListNumber"/>
+        <w:spacing w:after="40"/>
+      </w:pPr>
+      <w:r>
+        <w:t>Введите причину запуска: например, «первичная настройка PostgreSQL» или «проверка перед testnet».</w:t>
+      </w:r>
+    </w:p>
+    <w:p>
+      <w:pPr>
+        <w:pStyle w:val="ListNumber"/>
+        <w:spacing w:after="40"/>
+      </w:pPr>
+      <w:r>
+        <w:t>Нажмите нужную команду.</w:t>
+      </w:r>
+    </w:p>
+    <w:p>
+      <w:pPr>
+        <w:pStyle w:val="ListNumber"/>
+        <w:spacing w:after="40"/>
+      </w:pPr>
+      <w:r>
+        <w:t>Дождитесь статуса job и прочитайте `stdout/stderr`.</w:t>
+      </w:r>
+    </w:p>
+    <w:p>
+      <w:pPr>
+        <w:spacing w:after="60"/>
+      </w:pPr>
+      <w:r>
+        <w:t>Важное ограничение: `Live preflight` не является кнопкой «начать торговать». Это только проверка. Даже при `status=ok` каждый live-order все равно требует approved `RiskDecision`, idempotency, DB constraints, reconciliation и protection.</w:t>
+      </w:r>
+    </w:p>
+    <w:p>
+      <w:pPr>
+        <w:pStyle w:val="Heading2"/>
+      </w:pPr>
+      <w:r>
+        <w:t>Paper/shadow</w:t>
+      </w:r>
+    </w:p>
+    <w:p>
+      <w:pPr>
+        <w:spacing w:after="60"/>
+      </w:pPr>
+      <w:r>
+        <w:t>В интерфейсе нажать **Paper один раз** для smoke-проверки конвейера. Для допуска к live нужен не одиночный запуск, а 14+ дней Phase 0 paper/shadow evidence с reconciliation PASS и без unresolved incidents.</w:t>
+      </w:r>
+    </w:p>
+    <w:p>
+      <w:pPr>
+        <w:pStyle w:val="Heading2"/>
+      </w:pPr>
+      <w:r>
+        <w:t>Когда можно переходить к реальной торговле</w:t>
+      </w:r>
+    </w:p>
+    <w:p>
+      <w:pPr>
+        <w:spacing w:after="60"/>
+      </w:pPr>
+      <w:r>
+        <w:t>Только когда выполнено все:</w:t>
+      </w:r>
+    </w:p>
+    <w:p>
+      <w:pPr>
+        <w:pStyle w:val="ListNumber"/>
+        <w:spacing w:after="40"/>
+      </w:pPr>
+      <w:r>
+        <w:t>`python main.py validate` - PASS.</w:t>
+      </w:r>
+    </w:p>
+    <w:p>
+      <w:pPr>
+        <w:pStyle w:val="ListNumber"/>
+        <w:spacing w:after="40"/>
+      </w:pPr>
+      <w:r>
+        <w:t>PostgreSQL поднят, миграции применены.</w:t>
+      </w:r>
+    </w:p>
+    <w:p>
+      <w:pPr>
+        <w:pStyle w:val="ListNumber"/>
+        <w:spacing w:after="40"/>
+      </w:pPr>
+      <w:r>
+        <w:t>`python main.py preflight --mode testnet` - PASS.</w:t>
+      </w:r>
+    </w:p>
+    <w:p>
+      <w:pPr>
+        <w:pStyle w:val="ListNumber"/>
+        <w:spacing w:after="40"/>
+      </w:pPr>
+      <w:r>
+        <w:t>Накоплено не менее 14 дней Phase 0 paper/shadow evidence.</w:t>
+      </w:r>
+    </w:p>
+    <w:p>
+      <w:pPr>
+        <w:pStyle w:val="ListNumber"/>
+        <w:spacing w:after="40"/>
+      </w:pPr>
+      <w:r>
+        <w:t>Нет unresolved CRITICAL/HIGH incidents.</w:t>
+      </w:r>
+    </w:p>
+    <w:p>
+      <w:pPr>
+        <w:pStyle w:val="ListNumber"/>
+        <w:spacing w:after="40"/>
+      </w:pPr>
+      <w:r>
+        <w:t>Есть evidence `RECONCILIATION=PASS`, `SECURITY=PASS`, `CI=PASS`.</w:t>
+      </w:r>
+    </w:p>
+    <w:p>
+      <w:pPr>
+        <w:pStyle w:val="ListNumber"/>
+        <w:spacing w:after="40"/>
+      </w:pPr>
+      <w:r>
+        <w:t>Есть подписанный `GO_NO_GO=PASS`.</w:t>
+      </w:r>
+    </w:p>
+    <w:p>
+      <w:pPr>
+        <w:pStyle w:val="ListNumber"/>
+        <w:spacing w:after="40"/>
+      </w:pPr>
+      <w:r>
+        <w:t>`python main.py preflight --mode live` - PASS.</w:t>
+      </w:r>
+    </w:p>
+    <w:p>
+      <w:pPr>
+        <w:pStyle w:val="ListNumber"/>
+        <w:spacing w:after="40"/>
+      </w:pPr>
+      <w:r>
+        <w:t>API-ключи Bybit хранятся только server-side.</w:t>
+      </w:r>
+    </w:p>
+    <w:p>
+      <w:pPr>
+        <w:pStyle w:val="ListNumber"/>
+        <w:spacing w:after="40"/>
+      </w:pPr>
+      <w:r>
+        <w:t>Оператор понимает, что HTTP ack от Bybit не является fill; ACTIVE допустим только после reconciliation PASS и protection_state=VALID.</w:t>
+      </w:r>
+    </w:p>
+    <w:p>
+      <w:pPr>
+        <w:pStyle w:val="Heading2"/>
+      </w:pPr>
+      <w:r>
+        <w:t>Что запрещено</w:t>
+      </w:r>
+    </w:p>
+    <w:p>
+      <w:pPr>
+        <w:pStyle w:val="ListBullet"/>
+        <w:spacing w:after="40"/>
+      </w:pPr>
+      <w:r>
+        <w:t>Открывать сделку вручную в обход risk engine.</w:t>
+      </w:r>
+    </w:p>
+    <w:p>
+      <w:pPr>
+        <w:pStyle w:val="ListBullet"/>
+        <w:spacing w:after="40"/>
       </w:pPr>
       <w:r>
         <w:t>Повторять submit с новым idempotency key после timeout.</w:t>
@@ -1638,123 +620,558 @@
     <w:p>
       <w:pPr>
         <w:pStyle w:val="ListBullet"/>
+        <w:spacing w:after="40"/>
       </w:pPr>
       <w:r>
-        <w:t>Включать live-submit, если live preflight blocked.</w:t>
+        <w:t>Увеличивать риск из-за просадки или желания быстрее выйти к цели.</w:t>
       </w:r>
     </w:p>
     <w:p>
       <w:pPr>
         <w:pStyle w:val="ListBullet"/>
+        <w:spacing w:after="40"/>
       </w:pPr>
       <w:r>
-        <w:t>Повышать risk_pct или leverage ради восстановления просадки.</w:t>
+        <w:t>Включать carry/stat-arb live в Phase 0/1.</w:t>
       </w:r>
     </w:p>
     <w:p>
       <w:pPr>
         <w:pStyle w:val="ListBullet"/>
+        <w:spacing w:after="40"/>
       </w:pPr>
       <w:r>
-        <w:t>Использовать carry/stat-arb live в Phase 0/1.</w:t>
+        <w:t>Хранить ключи Bybit во frontend или отправлять их в браузер.</w:t>
       </w:r>
     </w:p>
     <w:p>
       <w:pPr>
         <w:pStyle w:val="ListBullet"/>
+        <w:spacing w:after="40"/>
       </w:pPr>
       <w:r>
-        <w:t>Хранить Bybit-ключи во frontend или вставлять их в браузерный код.</w:t>
+        <w:t>Считать `blocked` ошибкой интерфейса без анализа причин.</w:t>
       </w:r>
     </w:p>
     <w:p>
       <w:pPr>
-        <w:pStyle w:val="Heading1"/>
+        <w:pStyle w:val="Heading2"/>
       </w:pPr>
       <w:r>
-        <w:t>6. Контекстная справка</w:t>
+        <w:t>Аварийные действия</w:t>
+      </w:r>
+    </w:p>
+    <w:p>
+      <w:pPr>
+        <w:spacing w:after="60"/>
+      </w:pPr>
+      <w:r>
+        <w:t>Разрешены только действия, снижающие риск:</w:t>
+      </w:r>
+    </w:p>
+    <w:p>
+      <w:pPr>
+        <w:pStyle w:val="ListBullet"/>
+        <w:spacing w:after="40"/>
+      </w:pPr>
+      <w:r>
+        <w:t>`DISABLE_TRADING` - выключить новые входы.</w:t>
+      </w:r>
+    </w:p>
+    <w:p>
+      <w:pPr>
+        <w:pStyle w:val="ListBullet"/>
+        <w:spacing w:after="40"/>
+      </w:pPr>
+      <w:r>
+        <w:t>`CANCEL_OPEN_ENTRIES` - отменить открытые входные заявки.</w:t>
+      </w:r>
+    </w:p>
+    <w:p>
+      <w:pPr>
+        <w:pStyle w:val="ListBullet"/>
+        <w:spacing w:after="40"/>
+      </w:pPr>
+      <w:r>
+        <w:t>`FLATTEN_REDUCE` - уменьшить или закрыть риск через reduce-only.</w:t>
+      </w:r>
+    </w:p>
+    <w:p>
+      <w:pPr>
+        <w:pStyle w:val="ListBullet"/>
+        <w:spacing w:after="40"/>
+      </w:pPr>
+      <w:r>
+        <w:t>`RESOLVE_INCIDENT` - закрыть инцидент только после проверки.</w:t>
+      </w:r>
+    </w:p>
+    <w:p>
+      <w:pPr>
+        <w:spacing w:after="60"/>
+      </w:pPr>
+      <w:r>
+        <w:t>Каждое действие требует `OPERATOR_API_KEY` и понятную причину.</w:t>
+      </w:r>
+    </w:p>
+    <w:p>
+      <w:pPr>
+        <w:pStyle w:val="Heading2"/>
+      </w:pPr>
+      <w:r>
+        <w:t>Интерактивная справка прямо в интерфейсе</w:t>
+      </w:r>
+    </w:p>
+    <w:p>
+      <w:pPr>
+        <w:spacing w:after="60"/>
+      </w:pPr>
+      <w:r>
+        <w:t>В новой версии операторского модуля у каждого ключевого блока есть контекстная справка.</w:t>
+      </w:r>
+    </w:p>
+    <w:p>
+      <w:pPr>
+        <w:spacing w:after="60"/>
+      </w:pPr>
+      <w:r>
+        <w:t>Как пользоваться:</w:t>
+      </w:r>
+    </w:p>
+    <w:p>
+      <w:pPr>
+        <w:pStyle w:val="ListNumber"/>
+        <w:spacing w:after="40"/>
+      </w:pPr>
+      <w:r>
+        <w:t>Наведите мышь на непонятный блок: карточку допуска, блокер, шаг плана, символ, safe-action, результат paper или диагностику.</w:t>
+      </w:r>
+    </w:p>
+    <w:p>
+      <w:pPr>
+        <w:pStyle w:val="ListNumber"/>
+        <w:spacing w:after="40"/>
+      </w:pPr>
+      <w:r>
+        <w:t>Нажмите правую кнопку мыши.</w:t>
+      </w:r>
+    </w:p>
+    <w:p>
+      <w:pPr>
+        <w:pStyle w:val="ListNumber"/>
+        <w:spacing w:after="40"/>
+      </w:pPr>
+      <w:r>
+        <w:t>Выберите пункт **«Вызвать справку»**.</w:t>
+      </w:r>
+    </w:p>
+    <w:p>
+      <w:pPr>
+        <w:pStyle w:val="ListNumber"/>
+        <w:spacing w:after="40"/>
+      </w:pPr>
+      <w:r>
+        <w:t>Прочитайте диалог: там указано, что означает блок, что делать оператору, когда состояние считается нормой и чего нельзя делать.</w:t>
+      </w:r>
+    </w:p>
+    <w:p>
+      <w:pPr>
+        <w:spacing w:after="60"/>
+      </w:pPr>
+      <w:r>
+        <w:t>Примеры:</w:t>
+      </w:r>
+    </w:p>
+    <w:p>
+      <w:pPr>
+        <w:pStyle w:val="ListBullet"/>
+        <w:spacing w:after="40"/>
+      </w:pPr>
+      <w:r>
+        <w:t>Правая кнопка по карточке **Live gate** объяснит, почему live закрыт и какие gates нужно пройти.</w:t>
+      </w:r>
+    </w:p>
+    <w:p>
+      <w:pPr>
+        <w:pStyle w:val="ListBullet"/>
+        <w:spacing w:after="40"/>
+      </w:pPr>
+      <w:r>
+        <w:t>Правая кнопка по символу **BTCUSDT** объяснит его `status_effective`, причины вроде `stale_market`, разрешенные действия и Trace ID.</w:t>
+      </w:r>
+    </w:p>
+    <w:p>
+      <w:pPr>
+        <w:pStyle w:val="ListBullet"/>
+        <w:spacing w:after="40"/>
+      </w:pPr>
+      <w:r>
+        <w:t>Правая кнопка по шагу **PostgreSQL и миграции** покажет команду и критерий PASS.</w:t>
+      </w:r>
+    </w:p>
+    <w:p>
+      <w:pPr>
+        <w:pStyle w:val="ListBullet"/>
+        <w:spacing w:after="40"/>
+      </w:pPr>
+      <w:r>
+        <w:t>Правая кнопка по действию **Снизить / закрыть риск** объяснит, когда его можно применять и почему оно не является торговой кнопкой.</w:t>
+      </w:r>
+    </w:p>
+    <w:p>
+      <w:pPr>
+        <w:spacing w:after="60"/>
+      </w:pPr>
+      <w:r>
+        <w:t>Кнопка **«Справка»** в верхней панели открывает общую справку по экрану.</w:t>
+      </w:r>
+    </w:p>
+    <w:p>
+      <w:pPr>
+        <w:pStyle w:val="Heading2"/>
+      </w:pPr>
+      <w:r>
+        <w:t>Что делать с результатами команд</w:t>
+      </w:r>
+    </w:p>
+    <w:p>
+      <w:pPr>
+        <w:spacing w:after="60"/>
+      </w:pPr>
+      <w:r>
+        <w:t>В Операционном центре смотрите не только на текст stdout/stderr, но и на статус карточки:</w:t>
       </w:r>
     </w:p>
     <w:p>
       <w:r>
-        <w:t>Правая кнопка мыши по любому ключевому блоку открывает меню “Вызвать справку”. В диалоге будет объяснено, что означает компонент, что делать сейчас, когда состояние нормально и чего нельзя делать.</w:t>
+        <w:rPr>
+          <w:rFonts w:ascii="Consolas" w:hAnsi="Consolas" w:eastAsia="Consolas"/>
+          <w:sz w:val="14"/>
+        </w:rPr>
+        <w:t>| Статус | Что означает | Что делать |</w:t>
       </w:r>
     </w:p>
     <w:p>
       <w:r>
-        <w:t>Кнопка “Справка” в верхней панели открывает общую справку по экрану.</w:t>
+        <w:rPr>
+          <w:rFonts w:ascii="Consolas" w:hAnsi="Consolas" w:eastAsia="Consolas"/>
+          <w:sz w:val="14"/>
+        </w:rPr>
+        <w:t>|---|---|---|</w:t>
       </w:r>
     </w:p>
     <w:p>
-      <w:pPr>
-        <w:pStyle w:val="Heading1"/>
-      </w:pPr>
       <w:r>
-        <w:t>7. Минимальный путь до live</w:t>
+        <w:rPr>
+          <w:rFonts w:ascii="Consolas" w:hAnsi="Consolas" w:eastAsia="Consolas"/>
+          <w:sz w:val="14"/>
+        </w:rPr>
+        <w:t>| `ok` | Команда прошла | Переходите к следующему шагу плана |</w:t>
       </w:r>
     </w:p>
     <w:p>
-      <w:pPr>
-        <w:pStyle w:val="ListNumber"/>
-      </w:pPr>
       <w:r>
-        <w:t>validate PASS.</w:t>
+        <w:rPr>
+          <w:rFonts w:ascii="Consolas" w:hAnsi="Consolas" w:eastAsia="Consolas"/>
+          <w:sz w:val="14"/>
+        </w:rPr>
+        <w:t>| `blocked` | Система безопасно не дала пройти дальше | Читайте `reasons`, исправляйте причину и повторяйте |</w:t>
       </w:r>
     </w:p>
     <w:p>
-      <w:pPr>
-        <w:pStyle w:val="ListNumber"/>
-      </w:pPr>
       <w:r>
-        <w:t>PostgreSQL поднят, migrations применены.</w:t>
+        <w:rPr>
+          <w:rFonts w:ascii="Consolas" w:hAnsi="Consolas" w:eastAsia="Consolas"/>
+          <w:sz w:val="14"/>
+        </w:rPr>
+        <w:t>| `error` | Ошибка исполнения, traceback или упавший тест | Остановитесь, исправьте код/настройки, live запрещен |</w:t>
       </w:r>
     </w:p>
     <w:p>
-      <w:pPr>
-        <w:pStyle w:val="ListNumber"/>
-      </w:pPr>
       <w:r>
-        <w:t>testnet preflight PASS.</w:t>
+        <w:rPr>
+          <w:rFonts w:ascii="Consolas" w:hAnsi="Consolas" w:eastAsia="Consolas"/>
+          <w:sz w:val="14"/>
+        </w:rPr>
+        <w:t>| `timeout` | Команда зависла или не уложилась во время | Проверьте PostgreSQL, сеть, зависимости и повторите |</w:t>
       </w:r>
     </w:p>
     <w:p>
       <w:pPr>
-        <w:pStyle w:val="ListNumber"/>
+        <w:spacing w:after="60"/>
       </w:pPr>
       <w:r>
-        <w:t>14+ дней Phase 0 paper/shadow evidence.</w:t>
+        <w:t>Если preflight показывает `incidents_table_missing_or_migrations_not_applied` или `go_no_go_tables_missing_or_migrations_not_applied`, нажмите **PostgreSQL: применить migrations**. До этого live-проверка не обязана проходить.</w:t>
       </w:r>
     </w:p>
     <w:p>
       <w:pPr>
-        <w:pStyle w:val="ListNumber"/>
+        <w:pStyle w:val="Heading2"/>
       </w:pPr>
       <w:r>
-        <w:t>reconciliation/security/CI evidence PASS.</w:t>
+        <w:t>Обновление интерфейса: меньше дублей, команды прямо в плане</w:t>
       </w:r>
     </w:p>
     <w:p>
       <w:pPr>
-        <w:pStyle w:val="ListNumber"/>
+        <w:spacing w:after="60"/>
       </w:pPr>
       <w:r>
-        <w:t>Go/No-Go PASS с approved-by.</w:t>
+        <w:t>Новая компоновка экрана устроена так:</w:t>
       </w:r>
     </w:p>
     <w:p>
       <w:pPr>
         <w:pStyle w:val="ListNumber"/>
+        <w:spacing w:after="40"/>
       </w:pPr>
       <w:r>
-        <w:t>live preflight PASS.</w:t>
+        <w:t>**Главный статус** — один верхний ответ: что происходит и что делать сейчас.</w:t>
       </w:r>
     </w:p>
     <w:p>
       <w:pPr>
         <w:pStyle w:val="ListNumber"/>
+        <w:spacing w:after="40"/>
       </w:pPr>
       <w:r>
-        <w:t>Каждый order имеет approved non-expired RiskDecision, idempotency и verified protection/reconciliation.</w:t>
+        <w:t>**Панель допуска** — короткие компактные индикаторы, а не отдельный большой отчет.</w:t>
+      </w:r>
+    </w:p>
+    <w:p>
+      <w:pPr>
+        <w:pStyle w:val="ListNumber"/>
+        <w:spacing w:after="40"/>
+      </w:pPr>
+      <w:r>
+        <w:t>**Операционный центр: план и запуск** — единый блок вместо двух дублирующих разделов. Команда показана в черном поле, а справа от нее есть кнопка запуска `▶`. Если кнопки нет, значит шаг требует ручной записи evidence или длительного paper/shadow периода.</w:t>
+      </w:r>
+    </w:p>
+    <w:p>
+      <w:pPr>
+        <w:pStyle w:val="ListNumber"/>
+        <w:spacing w:after="40"/>
+      </w:pPr>
+      <w:r>
+        <w:t>**Что мешает запуску** и **Настройки Phase 0** — рядом, чтобы не тратить вертикальное место.</w:t>
+      </w:r>
+    </w:p>
+    <w:p>
+      <w:pPr>
+        <w:pStyle w:val="ListNumber"/>
+        <w:spacing w:after="40"/>
+      </w:pPr>
+      <w:r>
+        <w:t>**Символы** и **Детали символа** — рядом: выбрали пару слева, расшифровку сразу видите справа.</w:t>
+      </w:r>
+    </w:p>
+    <w:p>
+      <w:pPr>
+        <w:pStyle w:val="Heading3"/>
+      </w:pPr>
+      <w:r>
+        <w:t>Как запускать команду из карточки плана</w:t>
+      </w:r>
+    </w:p>
+    <w:p>
+      <w:pPr>
+        <w:pStyle w:val="ListNumber"/>
+        <w:spacing w:after="40"/>
+      </w:pPr>
+      <w:r>
+        <w:t>В блоке **Операционный центр: план и запуск** введите `OPERATOR_API_KEY`.</w:t>
+      </w:r>
+    </w:p>
+    <w:p>
+      <w:pPr>
+        <w:pStyle w:val="ListNumber"/>
+        <w:spacing w:after="40"/>
+      </w:pPr>
+      <w:r>
+        <w:t>Введите причину запуска. Пример: `проверка после исправления тестов`, `применение миграций PostgreSQL`, `testnet preflight после настройки ключей`.</w:t>
+      </w:r>
+    </w:p>
+    <w:p>
+      <w:pPr>
+        <w:pStyle w:val="ListNumber"/>
+        <w:spacing w:after="40"/>
+      </w:pPr>
+      <w:r>
+        <w:t>На нужной карточке нажмите **Запустить** или кнопку `▶` рядом с черным полем команды.</w:t>
+      </w:r>
+    </w:p>
+    <w:p>
+      <w:pPr>
+        <w:pStyle w:val="ListNumber"/>
+        <w:spacing w:after="40"/>
+      </w:pPr>
+      <w:r>
+        <w:t>Дождитесь результата в блоке под планом.</w:t>
+      </w:r>
+    </w:p>
+    <w:p>
+      <w:pPr>
+        <w:pStyle w:val="ListNumber"/>
+        <w:spacing w:after="40"/>
+      </w:pPr>
+      <w:r>
+        <w:t>Если статус `blocked`, смотрите `reasons`. Если статус `error`, исправляйте traceback/pytest failure; live запрещен.</w:t>
+      </w:r>
+    </w:p>
+    <w:p>
+      <w:pPr>
+        <w:pStyle w:val="Heading3"/>
+      </w:pPr>
+      <w:r>
+        <w:t>Testnet preflight больше не требует live Go/No-Go</w:t>
+      </w:r>
+    </w:p>
+    <w:p>
+      <w:pPr>
+        <w:spacing w:after="60"/>
+      </w:pPr>
+      <w:r>
+        <w:t>`python main.py preflight --mode testnet` теперь проверяет именно testnet readiness. Он не должен требовать `CAS_ENABLE_LIVE_SUBMIT`, live Go/No-Go и 14 дней paper evidence. Если testnet preflight заблокирован, причины должны быть уровня: нет PostgreSQL, нет testnet Bybit credentials, не выбран testnet endpoint, не применены migrations или есть unresolved incidents.</w:t>
+      </w:r>
+    </w:p>
+    <w:p>
+      <w:pPr>
+        <w:spacing w:after="60"/>
+      </w:pPr>
+      <w:r>
+        <w:t>`python main.py preflight --mode live` остается строгим live gate и обязан требовать DB, Bybit runtime, paper/shadow evidence, security/CI/reconciliation evidence, signed Go/No-Go и отсутствие unresolved CRITICAL/HIGH.</w:t>
+      </w:r>
+    </w:p>
+    <w:p>
+      <w:pPr>
+        <w:pStyle w:val="Heading2"/>
+      </w:pPr>
+      <w:r>
+        <w:t>Testnet preflight: public OK, private API заблокирован</w:t>
+      </w:r>
+    </w:p>
+    <w:p>
+      <w:pPr>
+        <w:spacing w:after="60"/>
+      </w:pPr>
+      <w:r>
+        <w:t>Если `python main.py preflight --mode testnet` показывает примерно такое:</w:t>
+      </w:r>
+    </w:p>
+    <w:p>
+      <w:pPr>
+        <w:shd w:fill="F1F5F9"/>
+      </w:pPr>
+      <w:r>
+        <w:rPr>
+          <w:rFonts w:ascii="Consolas" w:hAnsi="Consolas" w:eastAsia="Consolas"/>
+          <w:sz w:val="16"/>
+        </w:rPr>
+        <w:t>{</w:t>
+        <w:br/>
+        <w:t xml:space="preserve">  "status": "blocked",</w:t>
+        <w:br/>
+        <w:t xml:space="preserve">  "reasons": ["bybit_private_api_auth_failed:..."],</w:t>
+        <w:br/>
+        <w:t xml:space="preserve">  "checks": {</w:t>
+        <w:br/>
+        <w:t xml:space="preserve">    "bybit_public_api_reachable": true,</w:t>
+        <w:br/>
+        <w:t xml:space="preserve">    "runtime_instrument_specs_verified": true,</w:t>
+        <w:br/>
+        <w:t xml:space="preserve">    "bybit_private_api_verified": false,</w:t>
+        <w:br/>
+        <w:t xml:space="preserve">    "bybit_api_key_trade_permission_verified": false</w:t>
+        <w:br/>
+        <w:t xml:space="preserve">  }</w:t>
+        <w:br/>
+        <w:t>}</w:t>
+      </w:r>
+    </w:p>
+    <w:p>
+      <w:pPr>
+        <w:spacing w:after="60"/>
+      </w:pPr>
+      <w:r>
+        <w:t>это значит: публичная часть Bybit доступна, спецификации BTC/ETH/SOL прочитаны, но private API не подтвердил ключи или permissions. Это не ошибка frontend и не причина включать live вручную.</w:t>
+      </w:r>
+    </w:p>
+    <w:p>
+      <w:pPr>
+        <w:spacing w:after="60"/>
+      </w:pPr>
+      <w:r>
+        <w:t>Что делать оператору:</w:t>
+      </w:r>
+    </w:p>
+    <w:p>
+      <w:pPr>
+        <w:pStyle w:val="ListNumber"/>
+        <w:spacing w:after="40"/>
+      </w:pPr>
+      <w:r>
+        <w:t>Убедиться, что `BYBIT_TESTNET=true`.</w:t>
+      </w:r>
+    </w:p>
+    <w:p>
+      <w:pPr>
+        <w:pStyle w:val="ListNumber"/>
+        <w:spacing w:after="40"/>
+      </w:pPr>
+      <w:r>
+        <w:t>Проверить, что `BYBIT_API_KEY` и `BYBIT_API_SECRET` созданы именно в Bybit testnet, а не в live-кабинете.</w:t>
+      </w:r>
+    </w:p>
+    <w:p>
+      <w:pPr>
+        <w:pStyle w:val="ListNumber"/>
+        <w:spacing w:after="40"/>
+      </w:pPr>
+      <w:r>
+        <w:t>Проверить, что в `.env` нет лишних пробелов, кавычек и переносов строк в ключах.</w:t>
+      </w:r>
+    </w:p>
+    <w:p>
+      <w:pPr>
+        <w:pStyle w:val="ListNumber"/>
+        <w:spacing w:after="40"/>
+      </w:pPr>
+      <w:r>
+        <w:t>Проверить IP whitelist ключа Bybit: IP текущего ПК/VPS должен быть разрешен.</w:t>
+      </w:r>
+    </w:p>
+    <w:p>
+      <w:pPr>
+        <w:pStyle w:val="ListNumber"/>
+        <w:spacing w:after="40"/>
+      </w:pPr>
+      <w:r>
+        <w:t>Проверить права API-ключа: для testnet runtime нужны Linear/Contract/Derivatives права на чтение wallet/positions и trade/order permission для дальнейших testnet-сценариев.</w:t>
+      </w:r>
+    </w:p>
+    <w:p>
+      <w:pPr>
+        <w:pStyle w:val="ListNumber"/>
+        <w:spacing w:after="40"/>
+      </w:pPr>
+      <w:r>
+        <w:t>Перезапустить backend после изменения `.env`.</w:t>
+      </w:r>
+    </w:p>
+    <w:p>
+      <w:pPr>
+        <w:pStyle w:val="ListNumber"/>
+        <w:spacing w:after="40"/>
+      </w:pPr>
+      <w:r>
+        <w:t>Повторить `Testnet preflight` из интерфейса.</w:t>
+      </w:r>
+    </w:p>
+    <w:p>
+      <w:pPr>
+        <w:spacing w:after="60"/>
+      </w:pPr>
+      <w:r>
+        <w:t>Актуальная версия preflight показывает не общий `RuntimeError`, а конкретные причины: `bybit_private_api_auth_failed`, `bybit_wallet_balance_failed`, `bybit_positions_failed`, `bybit_api_key_trade_permission_not_verified`, а также безопасную диагностику `ret_code`, `ret_msg`, `path` без вывода секретов.</w:t>
       </w:r>
     </w:p>
     <w:sectPr>
@@ -2131,8 +1548,8 @@
     <w:qFormat/>
     <w:rsid w:val="00FC693F"/>
     <w:rPr>
-      <w:rFonts w:ascii="Arial" w:hAnsi="Arial"/>
-      <w:sz w:val="19"/>
+      <w:rFonts w:ascii="Arial" w:hAnsi="Arial" w:eastAsia="Arial"/>
+      <w:sz w:val="18"/>
     </w:rPr>
   </w:style>
   <w:style w:type="paragraph" w:styleId="Header">
@@ -2194,11 +1611,11 @@
       <w:outlineLvl w:val="0"/>
     </w:pPr>
     <w:rPr>
-      <w:rFonts w:asciiTheme="majorHAnsi" w:eastAsiaTheme="majorEastAsia" w:hAnsiTheme="majorHAnsi" w:cstheme="majorBidi" w:ascii="Arial" w:hAnsi="Arial"/>
+      <w:rFonts w:asciiTheme="majorHAnsi" w:eastAsiaTheme="majorEastAsia" w:hAnsiTheme="majorHAnsi" w:cstheme="majorBidi" w:ascii="Arial" w:hAnsi="Arial" w:eastAsia="Arial"/>
       <w:b/>
       <w:bCs/>
       <w:color w:val="365F91" w:themeColor="accent1" w:themeShade="BF"/>
-      <w:sz w:val="36"/>
+      <w:sz w:val="32"/>
       <w:szCs w:val="28"/>
     </w:rPr>
   </w:style>
@@ -2218,7 +1635,7 @@
       <w:outlineLvl w:val="1"/>
     </w:pPr>
     <w:rPr>
-      <w:rFonts w:asciiTheme="majorHAnsi" w:eastAsiaTheme="majorEastAsia" w:hAnsiTheme="majorHAnsi" w:cstheme="majorBidi" w:ascii="Arial" w:hAnsi="Arial"/>
+      <w:rFonts w:asciiTheme="majorHAnsi" w:eastAsiaTheme="majorEastAsia" w:hAnsiTheme="majorHAnsi" w:cstheme="majorBidi" w:ascii="Arial" w:hAnsi="Arial" w:eastAsia="Arial"/>
       <w:b/>
       <w:bCs/>
       <w:color w:val="4F81BD" w:themeColor="accent1"/>
@@ -2242,7 +1659,7 @@
       <w:outlineLvl w:val="2"/>
     </w:pPr>
     <w:rPr>
-      <w:rFonts w:asciiTheme="majorHAnsi" w:eastAsiaTheme="majorEastAsia" w:hAnsiTheme="majorHAnsi" w:cstheme="majorBidi" w:ascii="Arial" w:hAnsi="Arial"/>
+      <w:rFonts w:asciiTheme="majorHAnsi" w:eastAsiaTheme="majorEastAsia" w:hAnsiTheme="majorHAnsi" w:cstheme="majorBidi" w:ascii="Arial" w:hAnsi="Arial" w:eastAsia="Arial"/>
       <w:b/>
       <w:bCs/>
       <w:color w:val="4F81BD" w:themeColor="accent1"/>

</xml_diff>

<commit_message>
feat: подготовить operator cockpit и live-gated safety workflow
- обновить frontend до темного enterprise/safety cockpit с light-theme toggle
- добавить audit-comment для allowlist operator jobs без browser storage и shell-доступа
- выводить trace_id/request_id для blockers и fail-closed status_effective-missing state
- сохранить backend status_effective как единственный источник статуса символов
- актуализировать README, RUNBOOK и OPERATOR_MANUAL под новый operator workflow
- синхронизировать prompts/redesign_front_page.txt с прикрепленным промптом
- подтвердить validate/pytest/static checks/secret scan и CLI smoke
</commit_message>
<xml_diff>
--- a/docs/OPERATOR_MANUAL.docx
+++ b/docs/OPERATOR_MANUAL.docx
@@ -1172,6 +1172,34 @@
       </w:pPr>
       <w:r>
         <w:t>Актуальная версия preflight показывает не общий `RuntimeError`, а конкретные причины: `bybit_private_api_auth_failed`, `bybit_wallet_balance_failed`, `bybit_positions_failed`, `bybit_api_key_trade_permission_not_verified`, а также безопасную диагностику `ret_code`, `ret_msg`, `path` без вывода секретов.</w:t>
+      </w:r>
+    </w:p>
+    <w:p>
+      <w:pPr>
+        <w:pStyle w:val="Heading2"/>
+      </w:pPr>
+      <w:r>
+        <w:t>Операторский cockpit 2026: тема и audit-comment</w:t>
+      </w:r>
+    </w:p>
+    <w:p>
+      <w:r>
+        <w:t>Новая версия операторского экрана использует темную enterprise/safety-тему по умолчанию. Светлая тема доступна кнопкой «Светлая тема» в верхней панели. Переключение темы не записывает данные в localStorage или sessionStorage.</w:t>
+      </w:r>
+    </w:p>
+    <w:p>
+      <w:r>
+        <w:t>В action-cockpit добавлено поле «Комментарий оператора, необязательно». Комментарий передается backend как audit-context в options для allowlist job. Он не является shell-командой, не передается напрямую в Bybit и не может включить live-submit.</w:t>
+      </w:r>
+    </w:p>
+    <w:p>
+      <w:r>
+        <w:t>Если backend не вернул status_effective по символу, frontend показывает fail-closed предупреждение «status_effective отсутствует» и не заменяет его зеленым ACTIVE. Таблица символов и карточка выбранного символа продолжают использовать одни и те же backend-поля: status_effective, severity, reasons, trace_id и allowed_actions.</w:t>
+      </w:r>
+    </w:p>
+    <w:p>
+      <w:r>
+        <w:t>Блок «Что мешает запуску» теперь дополнительно показывает trace_id/request_id рядом с причиной, чтобы оператор мог передать разработчику воспроизводимый идентификатор расследования.</w:t>
       </w:r>
     </w:p>
     <w:sectPr>

</xml_diff>